<commit_message>
Graduate report: static contents, lists of figures and tables, all figures
</commit_message>
<xml_diff>
--- a/docs/WLS_DPSC_Graduate_Report.docx
+++ b/docs/WLS_DPSC_Graduate_Report.docx
@@ -101,49 +101,1912 @@
     <w:p>
       <w:pPr>
         <w:pageBreakBefore/>
-        <w:spacing w:after="200"/>
+        <w:spacing w:after="240"/>
       </w:pPr>
       <w:r>
         <w:rPr>
           <w:b/>
           <w:bCs/>
           <w:color w:val="1F4E79"/>
-          <w:sz w:val="30"/>
-          <w:szCs w:val="30"/>
-        </w:rPr>
-        <w:t xml:space="preserve">Contents</w:t>
-      </w:r>
-    </w:p>
-    <w:sdt>
-      <w:sdtPr>
-        <w:alias w:val="Contents"/>
-      </w:sdtPr>
-      <w:sdtContent>
-        <w:p>
-          <w:r>
-            <w:fldChar w:fldCharType="begin" w:dirty="true"/>
-            <w:instrText xml:space="preserve">TOC \h \o "1-2"</w:instrText>
-            <w:fldChar w:fldCharType="separate"/>
-          </w:r>
-        </w:p>
-        <w:p>
-          <w:r>
-            <w:fldChar w:fldCharType="end"/>
-          </w:r>
-        </w:p>
-      </w:sdtContent>
-    </w:sdt>
-    <w:p>
-      <w:pPr>
-        <w:spacing w:after="140" w:line="312"/>
-        <w:jc w:val="both"/>
-      </w:pPr>
-      <w:r>
-        <w:rPr>
-          <w:i/>
-          <w:iCs/>
-        </w:rPr>
-        <w:t xml:space="preserve">Right-click the table and choose Update Field to refresh page numbers after opening in Word.</w:t>
+          <w:sz w:val="32"/>
+          <w:szCs w:val="32"/>
+        </w:rPr>
+        <w:t xml:space="preserve">Table of Contents</w:t>
+      </w:r>
+    </w:p>
+    <w:p>
+      <w:pPr>
+        <w:tabs>
+          <w:tab w:val="right" w:pos="9360" w:leader="dot"/>
+        </w:tabs>
+        <w:spacing w:after="90" w:before="80"/>
+        <w:ind w:left="0" w:right="500"/>
+      </w:pPr>
+      <w:r>
+        <w:rPr>
+          <w:b/>
+          <w:bCs/>
+          <w:sz w:val="22"/>
+          <w:szCs w:val="22"/>
+        </w:rPr>
+        <w:t xml:space="preserve">Abstract</w:t>
+      </w:r>
+      <w:r>
+        <w:rPr>
+          <w:b/>
+          <w:bCs/>
+          <w:sz w:val="22"/>
+          <w:szCs w:val="22"/>
+        </w:rPr>
+        <w:t xml:space="preserve">	6</w:t>
+      </w:r>
+    </w:p>
+    <w:p>
+      <w:pPr>
+        <w:tabs>
+          <w:tab w:val="right" w:pos="9360" w:leader="dot"/>
+        </w:tabs>
+        <w:spacing w:after="90" w:before="80"/>
+        <w:ind w:left="0" w:right="500"/>
+      </w:pPr>
+      <w:r>
+        <w:rPr>
+          <w:b/>
+          <w:bCs/>
+          <w:sz w:val="22"/>
+          <w:szCs w:val="22"/>
+        </w:rPr>
+        <w:t xml:space="preserve">1. Introduction</w:t>
+      </w:r>
+      <w:r>
+        <w:rPr>
+          <w:b/>
+          <w:bCs/>
+          <w:sz w:val="22"/>
+          <w:szCs w:val="22"/>
+        </w:rPr>
+        <w:t xml:space="preserve">	7</w:t>
+      </w:r>
+    </w:p>
+    <w:p>
+      <w:pPr>
+        <w:tabs>
+          <w:tab w:val="right" w:pos="9360" w:leader="dot"/>
+        </w:tabs>
+        <w:spacing w:after="90" w:before="80"/>
+        <w:ind w:left="0" w:right="500"/>
+      </w:pPr>
+      <w:r>
+        <w:rPr>
+          <w:b/>
+          <w:bCs/>
+          <w:sz w:val="22"/>
+          <w:szCs w:val="22"/>
+        </w:rPr>
+        <w:t xml:space="preserve">2. Literature Review</w:t>
+      </w:r>
+      <w:r>
+        <w:rPr>
+          <w:b/>
+          <w:bCs/>
+          <w:sz w:val="22"/>
+          <w:szCs w:val="22"/>
+        </w:rPr>
+        <w:t xml:space="preserve">	8</w:t>
+      </w:r>
+    </w:p>
+    <w:p>
+      <w:pPr>
+        <w:tabs>
+          <w:tab w:val="right" w:pos="9360" w:leader="dot"/>
+        </w:tabs>
+        <w:spacing w:after="40" w:before="0"/>
+        <w:ind w:left="440" w:right="500"/>
+      </w:pPr>
+      <w:r>
+        <w:rPr>
+          <w:b w:val="false"/>
+          <w:bCs w:val="false"/>
+          <w:sz w:val="20"/>
+          <w:szCs w:val="20"/>
+        </w:rPr>
+        <w:t xml:space="preserve">2.1 Dental pulp stem cells and their niche</w:t>
+      </w:r>
+      <w:r>
+        <w:rPr>
+          <w:b w:val="false"/>
+          <w:bCs w:val="false"/>
+          <w:sz w:val="20"/>
+          <w:szCs w:val="20"/>
+        </w:rPr>
+        <w:t xml:space="preserve">	8</w:t>
+      </w:r>
+    </w:p>
+    <w:p>
+      <w:pPr>
+        <w:tabs>
+          <w:tab w:val="right" w:pos="9360" w:leader="dot"/>
+        </w:tabs>
+        <w:spacing w:after="40" w:before="0"/>
+        <w:ind w:left="440" w:right="500"/>
+      </w:pPr>
+      <w:r>
+        <w:rPr>
+          <w:b w:val="false"/>
+          <w:bCs w:val="false"/>
+          <w:sz w:val="20"/>
+          <w:szCs w:val="20"/>
+        </w:rPr>
+        <w:t xml:space="preserve">2.2 Wnt signalling in tooth development and the pulp</w:t>
+      </w:r>
+      <w:r>
+        <w:rPr>
+          <w:b w:val="false"/>
+          <w:bCs w:val="false"/>
+          <w:sz w:val="20"/>
+          <w:szCs w:val="20"/>
+        </w:rPr>
+        <w:t xml:space="preserve">	8</w:t>
+      </w:r>
+    </w:p>
+    <w:p>
+      <w:pPr>
+        <w:tabs>
+          <w:tab w:val="right" w:pos="9360" w:leader="dot"/>
+        </w:tabs>
+        <w:spacing w:after="40" w:before="0"/>
+        <w:ind w:left="440" w:right="500"/>
+      </w:pPr>
+      <w:r>
+        <w:rPr>
+          <w:b w:val="false"/>
+          <w:bCs w:val="false"/>
+          <w:sz w:val="20"/>
+          <w:szCs w:val="20"/>
+        </w:rPr>
+        <w:t xml:space="preserve">2.3 WLS/GPR177 and Wnt ligand secretion</w:t>
+      </w:r>
+      <w:r>
+        <w:rPr>
+          <w:b w:val="false"/>
+          <w:bCs w:val="false"/>
+          <w:sz w:val="20"/>
+          <w:szCs w:val="20"/>
+        </w:rPr>
+        <w:t xml:space="preserve">	8</w:t>
+      </w:r>
+    </w:p>
+    <w:p>
+      <w:pPr>
+        <w:tabs>
+          <w:tab w:val="right" w:pos="9360" w:leader="dot"/>
+        </w:tabs>
+        <w:spacing w:after="40" w:before="0"/>
+        <w:ind w:left="440" w:right="500"/>
+      </w:pPr>
+      <w:r>
+        <w:rPr>
+          <w:b w:val="false"/>
+          <w:bCs w:val="false"/>
+          <w:sz w:val="20"/>
+          <w:szCs w:val="20"/>
+        </w:rPr>
+        <w:t xml:space="preserve">2.4 Single-cell atlases of human dental pulp</w:t>
+      </w:r>
+      <w:r>
+        <w:rPr>
+          <w:b w:val="false"/>
+          <w:bCs w:val="false"/>
+          <w:sz w:val="20"/>
+          <w:szCs w:val="20"/>
+        </w:rPr>
+        <w:t xml:space="preserve">	9</w:t>
+      </w:r>
+    </w:p>
+    <w:p>
+      <w:pPr>
+        <w:tabs>
+          <w:tab w:val="right" w:pos="9360" w:leader="dot"/>
+        </w:tabs>
+        <w:spacing w:after="40" w:before="0"/>
+        <w:ind w:left="440" w:right="500"/>
+      </w:pPr>
+      <w:r>
+        <w:rPr>
+          <w:b w:val="false"/>
+          <w:bCs w:val="false"/>
+          <w:sz w:val="20"/>
+          <w:szCs w:val="20"/>
+        </w:rPr>
+        <w:t xml:space="preserve">2.5 Methodological considerations for single-cell comparisons</w:t>
+      </w:r>
+      <w:r>
+        <w:rPr>
+          <w:b w:val="false"/>
+          <w:bCs w:val="false"/>
+          <w:sz w:val="20"/>
+          <w:szCs w:val="20"/>
+        </w:rPr>
+        <w:t xml:space="preserve">	9</w:t>
+      </w:r>
+    </w:p>
+    <w:p>
+      <w:pPr>
+        <w:tabs>
+          <w:tab w:val="right" w:pos="9360" w:leader="dot"/>
+        </w:tabs>
+        <w:spacing w:after="40" w:before="0"/>
+        <w:ind w:left="440" w:right="500"/>
+      </w:pPr>
+      <w:r>
+        <w:rPr>
+          <w:b w:val="false"/>
+          <w:bCs w:val="false"/>
+          <w:sz w:val="20"/>
+          <w:szCs w:val="20"/>
+        </w:rPr>
+        <w:t xml:space="preserve">2.6 Research gap and hypotheses</w:t>
+      </w:r>
+      <w:r>
+        <w:rPr>
+          <w:b w:val="false"/>
+          <w:bCs w:val="false"/>
+          <w:sz w:val="20"/>
+          <w:szCs w:val="20"/>
+        </w:rPr>
+        <w:t xml:space="preserve">	9</w:t>
+      </w:r>
+    </w:p>
+    <w:p>
+      <w:pPr>
+        <w:tabs>
+          <w:tab w:val="right" w:pos="9360" w:leader="dot"/>
+        </w:tabs>
+        <w:spacing w:after="90" w:before="80"/>
+        <w:ind w:left="0" w:right="500"/>
+      </w:pPr>
+      <w:r>
+        <w:rPr>
+          <w:b/>
+          <w:bCs/>
+          <w:sz w:val="22"/>
+          <w:szCs w:val="22"/>
+        </w:rPr>
+        <w:t xml:space="preserve">3. Materials and Methods</w:t>
+      </w:r>
+      <w:r>
+        <w:rPr>
+          <w:b/>
+          <w:bCs/>
+          <w:sz w:val="22"/>
+          <w:szCs w:val="22"/>
+        </w:rPr>
+        <w:t xml:space="preserve">	11</w:t>
+      </w:r>
+    </w:p>
+    <w:p>
+      <w:pPr>
+        <w:tabs>
+          <w:tab w:val="right" w:pos="9360" w:leader="dot"/>
+        </w:tabs>
+        <w:spacing w:after="40" w:before="0"/>
+        <w:ind w:left="440" w:right="500"/>
+      </w:pPr>
+      <w:r>
+        <w:rPr>
+          <w:b w:val="false"/>
+          <w:bCs w:val="false"/>
+          <w:sz w:val="20"/>
+          <w:szCs w:val="20"/>
+        </w:rPr>
+        <w:t xml:space="preserve">3.1 Study design and workflow</w:t>
+      </w:r>
+      <w:r>
+        <w:rPr>
+          <w:b w:val="false"/>
+          <w:bCs w:val="false"/>
+          <w:sz w:val="20"/>
+          <w:szCs w:val="20"/>
+        </w:rPr>
+        <w:t xml:space="preserve">	11</w:t>
+      </w:r>
+    </w:p>
+    <w:p>
+      <w:pPr>
+        <w:tabs>
+          <w:tab w:val="right" w:pos="9360" w:leader="dot"/>
+        </w:tabs>
+        <w:spacing w:after="40" w:before="0"/>
+        <w:ind w:left="440" w:right="500"/>
+      </w:pPr>
+      <w:r>
+        <w:rPr>
+          <w:b w:val="false"/>
+          <w:bCs w:val="false"/>
+          <w:sz w:val="20"/>
+          <w:szCs w:val="20"/>
+        </w:rPr>
+        <w:t xml:space="preserve">3.2 Data</w:t>
+      </w:r>
+      <w:r>
+        <w:rPr>
+          <w:b w:val="false"/>
+          <w:bCs w:val="false"/>
+          <w:sz w:val="20"/>
+          <w:szCs w:val="20"/>
+        </w:rPr>
+        <w:t xml:space="preserve">	11</w:t>
+      </w:r>
+    </w:p>
+    <w:p>
+      <w:pPr>
+        <w:tabs>
+          <w:tab w:val="right" w:pos="9360" w:leader="dot"/>
+        </w:tabs>
+        <w:spacing w:after="40" w:before="0"/>
+        <w:ind w:left="440" w:right="500"/>
+      </w:pPr>
+      <w:r>
+        <w:rPr>
+          <w:b w:val="false"/>
+          <w:bCs w:val="false"/>
+          <w:sz w:val="20"/>
+          <w:szCs w:val="20"/>
+        </w:rPr>
+        <w:t xml:space="preserve">3.3 Quality control and clustering</w:t>
+      </w:r>
+      <w:r>
+        <w:rPr>
+          <w:b w:val="false"/>
+          <w:bCs w:val="false"/>
+          <w:sz w:val="20"/>
+          <w:szCs w:val="20"/>
+        </w:rPr>
+        <w:t xml:space="preserve">	11</w:t>
+      </w:r>
+    </w:p>
+    <w:p>
+      <w:pPr>
+        <w:tabs>
+          <w:tab w:val="right" w:pos="9360" w:leader="dot"/>
+        </w:tabs>
+        <w:spacing w:after="40" w:before="0"/>
+        <w:ind w:left="440" w:right="500"/>
+      </w:pPr>
+      <w:r>
+        <w:rPr>
+          <w:b w:val="false"/>
+          <w:bCs w:val="false"/>
+          <w:sz w:val="20"/>
+          <w:szCs w:val="20"/>
+        </w:rPr>
+        <w:t xml:space="preserve">3.4 Doublet removal and integration</w:t>
+      </w:r>
+      <w:r>
+        <w:rPr>
+          <w:b w:val="false"/>
+          <w:bCs w:val="false"/>
+          <w:sz w:val="20"/>
+          <w:szCs w:val="20"/>
+        </w:rPr>
+        <w:t xml:space="preserve">	12</w:t>
+      </w:r>
+    </w:p>
+    <w:p>
+      <w:pPr>
+        <w:tabs>
+          <w:tab w:val="right" w:pos="9360" w:leader="dot"/>
+        </w:tabs>
+        <w:spacing w:after="40" w:before="0"/>
+        <w:ind w:left="440" w:right="500"/>
+      </w:pPr>
+      <w:r>
+        <w:rPr>
+          <w:b w:val="false"/>
+          <w:bCs w:val="false"/>
+          <w:sz w:val="20"/>
+          <w:szCs w:val="20"/>
+        </w:rPr>
+        <w:t xml:space="preserve">3.5 Cell type annotation</w:t>
+      </w:r>
+      <w:r>
+        <w:rPr>
+          <w:b w:val="false"/>
+          <w:bCs w:val="false"/>
+          <w:sz w:val="20"/>
+          <w:szCs w:val="20"/>
+        </w:rPr>
+        <w:t xml:space="preserve">	12</w:t>
+      </w:r>
+    </w:p>
+    <w:p>
+      <w:pPr>
+        <w:tabs>
+          <w:tab w:val="right" w:pos="9360" w:leader="dot"/>
+        </w:tabs>
+        <w:spacing w:after="40" w:before="0"/>
+        <w:ind w:left="440" w:right="500"/>
+      </w:pPr>
+      <w:r>
+        <w:rPr>
+          <w:b w:val="false"/>
+          <w:bCs w:val="false"/>
+          <w:sz w:val="20"/>
+          <w:szCs w:val="20"/>
+        </w:rPr>
+        <w:t xml:space="preserve">3.6 Definition of candidate DPSCs</w:t>
+      </w:r>
+      <w:r>
+        <w:rPr>
+          <w:b w:val="false"/>
+          <w:bCs w:val="false"/>
+          <w:sz w:val="20"/>
+          <w:szCs w:val="20"/>
+        </w:rPr>
+        <w:t xml:space="preserve">	12</w:t>
+      </w:r>
+    </w:p>
+    <w:p>
+      <w:pPr>
+        <w:tabs>
+          <w:tab w:val="right" w:pos="9360" w:leader="dot"/>
+        </w:tabs>
+        <w:spacing w:after="40" w:before="0"/>
+        <w:ind w:left="440" w:right="500"/>
+      </w:pPr>
+      <w:r>
+        <w:rPr>
+          <w:b w:val="false"/>
+          <w:bCs w:val="false"/>
+          <w:sz w:val="20"/>
+          <w:szCs w:val="20"/>
+        </w:rPr>
+        <w:t xml:space="preserve">3.7 Quantification and statistical analysis of WLS</w:t>
+      </w:r>
+      <w:r>
+        <w:rPr>
+          <w:b w:val="false"/>
+          <w:bCs w:val="false"/>
+          <w:sz w:val="20"/>
+          <w:szCs w:val="20"/>
+        </w:rPr>
+        <w:t xml:space="preserve">	13</w:t>
+      </w:r>
+    </w:p>
+    <w:p>
+      <w:pPr>
+        <w:tabs>
+          <w:tab w:val="right" w:pos="9360" w:leader="dot"/>
+        </w:tabs>
+        <w:spacing w:after="40" w:before="0"/>
+        <w:ind w:left="440" w:right="500"/>
+      </w:pPr>
+      <w:r>
+        <w:rPr>
+          <w:b w:val="false"/>
+          <w:bCs w:val="false"/>
+          <w:sz w:val="20"/>
+          <w:szCs w:val="20"/>
+        </w:rPr>
+        <w:t xml:space="preserve">3.8 Sensitivity analysis</w:t>
+      </w:r>
+      <w:r>
+        <w:rPr>
+          <w:b w:val="false"/>
+          <w:bCs w:val="false"/>
+          <w:sz w:val="20"/>
+          <w:szCs w:val="20"/>
+        </w:rPr>
+        <w:t xml:space="preserve">	13</w:t>
+      </w:r>
+    </w:p>
+    <w:p>
+      <w:pPr>
+        <w:tabs>
+          <w:tab w:val="right" w:pos="9360" w:leader="dot"/>
+        </w:tabs>
+        <w:spacing w:after="40" w:before="0"/>
+        <w:ind w:left="440" w:right="500"/>
+      </w:pPr>
+      <w:r>
+        <w:rPr>
+          <w:b w:val="false"/>
+          <w:bCs w:val="false"/>
+          <w:sz w:val="20"/>
+          <w:szCs w:val="20"/>
+        </w:rPr>
+        <w:t xml:space="preserve">3.9 Software and reproducibility</w:t>
+      </w:r>
+      <w:r>
+        <w:rPr>
+          <w:b w:val="false"/>
+          <w:bCs w:val="false"/>
+          <w:sz w:val="20"/>
+          <w:szCs w:val="20"/>
+        </w:rPr>
+        <w:t xml:space="preserve">	13</w:t>
+      </w:r>
+    </w:p>
+    <w:p>
+      <w:pPr>
+        <w:tabs>
+          <w:tab w:val="right" w:pos="9360" w:leader="dot"/>
+        </w:tabs>
+        <w:spacing w:after="90" w:before="80"/>
+        <w:ind w:left="0" w:right="500"/>
+      </w:pPr>
+      <w:r>
+        <w:rPr>
+          <w:b/>
+          <w:bCs/>
+          <w:sz w:val="22"/>
+          <w:szCs w:val="22"/>
+        </w:rPr>
+        <w:t xml:space="preserve">4. Results</w:t>
+      </w:r>
+      <w:r>
+        <w:rPr>
+          <w:b/>
+          <w:bCs/>
+          <w:sz w:val="22"/>
+          <w:szCs w:val="22"/>
+        </w:rPr>
+        <w:t xml:space="preserve">	14</w:t>
+      </w:r>
+    </w:p>
+    <w:p>
+      <w:pPr>
+        <w:tabs>
+          <w:tab w:val="right" w:pos="9360" w:leader="dot"/>
+        </w:tabs>
+        <w:spacing w:after="40" w:before="0"/>
+        <w:ind w:left="440" w:right="500"/>
+      </w:pPr>
+      <w:r>
+        <w:rPr>
+          <w:b w:val="false"/>
+          <w:bCs w:val="false"/>
+          <w:sz w:val="20"/>
+          <w:szCs w:val="20"/>
+        </w:rPr>
+        <w:t xml:space="preserve">4.1 Quality control and initial clustering</w:t>
+      </w:r>
+      <w:r>
+        <w:rPr>
+          <w:b w:val="false"/>
+          <w:bCs w:val="false"/>
+          <w:sz w:val="20"/>
+          <w:szCs w:val="20"/>
+        </w:rPr>
+        <w:t xml:space="preserve">	14</w:t>
+      </w:r>
+    </w:p>
+    <w:p>
+      <w:pPr>
+        <w:tabs>
+          <w:tab w:val="right" w:pos="9360" w:leader="dot"/>
+        </w:tabs>
+        <w:spacing w:after="40" w:before="0"/>
+        <w:ind w:left="440" w:right="500"/>
+      </w:pPr>
+      <w:r>
+        <w:rPr>
+          <w:b w:val="false"/>
+          <w:bCs w:val="false"/>
+          <w:sz w:val="20"/>
+          <w:szCs w:val="20"/>
+        </w:rPr>
+        <w:t xml:space="preserve">4.2 Doublets</w:t>
+      </w:r>
+      <w:r>
+        <w:rPr>
+          <w:b w:val="false"/>
+          <w:bCs w:val="false"/>
+          <w:sz w:val="20"/>
+          <w:szCs w:val="20"/>
+        </w:rPr>
+        <w:t xml:space="preserve">	14</w:t>
+      </w:r>
+    </w:p>
+    <w:p>
+      <w:pPr>
+        <w:tabs>
+          <w:tab w:val="right" w:pos="9360" w:leader="dot"/>
+        </w:tabs>
+        <w:spacing w:after="40" w:before="0"/>
+        <w:ind w:left="440" w:right="500"/>
+      </w:pPr>
+      <w:r>
+        <w:rPr>
+          <w:b w:val="false"/>
+          <w:bCs w:val="false"/>
+          <w:sz w:val="20"/>
+          <w:szCs w:val="20"/>
+        </w:rPr>
+        <w:t xml:space="preserve">4.3 Integration</w:t>
+      </w:r>
+      <w:r>
+        <w:rPr>
+          <w:b w:val="false"/>
+          <w:bCs w:val="false"/>
+          <w:sz w:val="20"/>
+          <w:szCs w:val="20"/>
+        </w:rPr>
+        <w:t xml:space="preserve">	14</w:t>
+      </w:r>
+    </w:p>
+    <w:p>
+      <w:pPr>
+        <w:tabs>
+          <w:tab w:val="right" w:pos="9360" w:leader="dot"/>
+        </w:tabs>
+        <w:spacing w:after="40" w:before="0"/>
+        <w:ind w:left="440" w:right="500"/>
+      </w:pPr>
+      <w:r>
+        <w:rPr>
+          <w:b w:val="false"/>
+          <w:bCs w:val="false"/>
+          <w:sz w:val="20"/>
+          <w:szCs w:val="20"/>
+        </w:rPr>
+        <w:t xml:space="preserve">4.4 Cell type composition</w:t>
+      </w:r>
+      <w:r>
+        <w:rPr>
+          <w:b w:val="false"/>
+          <w:bCs w:val="false"/>
+          <w:sz w:val="20"/>
+          <w:szCs w:val="20"/>
+        </w:rPr>
+        <w:t xml:space="preserve">	15</w:t>
+      </w:r>
+    </w:p>
+    <w:p>
+      <w:pPr>
+        <w:tabs>
+          <w:tab w:val="right" w:pos="9360" w:leader="dot"/>
+        </w:tabs>
+        <w:spacing w:after="40" w:before="0"/>
+        <w:ind w:left="440" w:right="500"/>
+      </w:pPr>
+      <w:r>
+        <w:rPr>
+          <w:b w:val="false"/>
+          <w:bCs w:val="false"/>
+          <w:sz w:val="20"/>
+          <w:szCs w:val="20"/>
+        </w:rPr>
+        <w:t xml:space="preserve">4.5 Candidate DPSCs are perivascular cells with progenitor features</w:t>
+      </w:r>
+      <w:r>
+        <w:rPr>
+          <w:b w:val="false"/>
+          <w:bCs w:val="false"/>
+          <w:sz w:val="20"/>
+          <w:szCs w:val="20"/>
+        </w:rPr>
+        <w:t xml:space="preserve">	16</w:t>
+      </w:r>
+    </w:p>
+    <w:p>
+      <w:pPr>
+        <w:tabs>
+          <w:tab w:val="right" w:pos="9360" w:leader="dot"/>
+        </w:tabs>
+        <w:spacing w:after="40" w:before="0"/>
+        <w:ind w:left="440" w:right="500"/>
+      </w:pPr>
+      <w:r>
+        <w:rPr>
+          <w:b w:val="false"/>
+          <w:bCs w:val="false"/>
+          <w:sz w:val="20"/>
+          <w:szCs w:val="20"/>
+        </w:rPr>
+        <w:t xml:space="preserve">4.6 WLS is detected in candidate DPSCs in every donor</w:t>
+      </w:r>
+      <w:r>
+        <w:rPr>
+          <w:b w:val="false"/>
+          <w:bCs w:val="false"/>
+          <w:sz w:val="20"/>
+          <w:szCs w:val="20"/>
+        </w:rPr>
+        <w:t xml:space="preserve">	17</w:t>
+      </w:r>
+    </w:p>
+    <w:p>
+      <w:pPr>
+        <w:tabs>
+          <w:tab w:val="right" w:pos="9360" w:leader="dot"/>
+        </w:tabs>
+        <w:spacing w:after="40" w:before="0"/>
+        <w:ind w:left="440" w:right="500"/>
+      </w:pPr>
+      <w:r>
+        <w:rPr>
+          <w:b w:val="false"/>
+          <w:bCs w:val="false"/>
+          <w:sz w:val="20"/>
+          <w:szCs w:val="20"/>
+        </w:rPr>
+        <w:t xml:space="preserve">4.7 WLS is not enriched in candidate DPSCs</w:t>
+      </w:r>
+      <w:r>
+        <w:rPr>
+          <w:b w:val="false"/>
+          <w:bCs w:val="false"/>
+          <w:sz w:val="20"/>
+          <w:szCs w:val="20"/>
+        </w:rPr>
+        <w:t xml:space="preserve">	18</w:t>
+      </w:r>
+    </w:p>
+    <w:p>
+      <w:pPr>
+        <w:tabs>
+          <w:tab w:val="right" w:pos="9360" w:leader="dot"/>
+        </w:tabs>
+        <w:spacing w:after="40" w:before="0"/>
+        <w:ind w:left="440" w:right="500"/>
+      </w:pPr>
+      <w:r>
+        <w:rPr>
+          <w:b w:val="false"/>
+          <w:bCs w:val="false"/>
+          <w:sz w:val="20"/>
+          <w:szCs w:val="20"/>
+        </w:rPr>
+        <w:t xml:space="preserve">4.8 WLS co-expression with WNT ligands is explained by sequencing depth</w:t>
+      </w:r>
+      <w:r>
+        <w:rPr>
+          <w:b w:val="false"/>
+          <w:bCs w:val="false"/>
+          <w:sz w:val="20"/>
+          <w:szCs w:val="20"/>
+        </w:rPr>
+        <w:t xml:space="preserve">	19</w:t>
+      </w:r>
+    </w:p>
+    <w:p>
+      <w:pPr>
+        <w:tabs>
+          <w:tab w:val="right" w:pos="9360" w:leader="dot"/>
+        </w:tabs>
+        <w:spacing w:after="40" w:before="0"/>
+        <w:ind w:left="440" w:right="500"/>
+      </w:pPr>
+      <w:r>
+        <w:rPr>
+          <w:b w:val="false"/>
+          <w:bCs w:val="false"/>
+          <w:sz w:val="20"/>
+          <w:szCs w:val="20"/>
+        </w:rPr>
+        <w:t xml:space="preserve">4.9 The result is robust to the DPSC definition</w:t>
+      </w:r>
+      <w:r>
+        <w:rPr>
+          <w:b w:val="false"/>
+          <w:bCs w:val="false"/>
+          <w:sz w:val="20"/>
+          <w:szCs w:val="20"/>
+        </w:rPr>
+        <w:t xml:space="preserve">	20</w:t>
+      </w:r>
+    </w:p>
+    <w:p>
+      <w:pPr>
+        <w:tabs>
+          <w:tab w:val="right" w:pos="9360" w:leader="dot"/>
+        </w:tabs>
+        <w:spacing w:after="40" w:before="0"/>
+        <w:ind w:left="440" w:right="500"/>
+      </w:pPr>
+      <w:r>
+        <w:rPr>
+          <w:b w:val="false"/>
+          <w:bCs w:val="false"/>
+          <w:sz w:val="20"/>
+          <w:szCs w:val="20"/>
+        </w:rPr>
+        <w:t xml:space="preserve">4.10 Donor differences in WLS detection reflect sequencing depth</w:t>
+      </w:r>
+      <w:r>
+        <w:rPr>
+          <w:b w:val="false"/>
+          <w:bCs w:val="false"/>
+          <w:sz w:val="20"/>
+          <w:szCs w:val="20"/>
+        </w:rPr>
+        <w:t xml:space="preserve">	21</w:t>
+      </w:r>
+    </w:p>
+    <w:p>
+      <w:pPr>
+        <w:tabs>
+          <w:tab w:val="right" w:pos="9360" w:leader="dot"/>
+        </w:tabs>
+        <w:spacing w:after="90" w:before="80"/>
+        <w:ind w:left="0" w:right="500"/>
+      </w:pPr>
+      <w:r>
+        <w:rPr>
+          <w:b/>
+          <w:bCs/>
+          <w:sz w:val="22"/>
+          <w:szCs w:val="22"/>
+        </w:rPr>
+        <w:t xml:space="preserve">5. Discussion</w:t>
+      </w:r>
+      <w:r>
+        <w:rPr>
+          <w:b/>
+          <w:bCs/>
+          <w:sz w:val="22"/>
+          <w:szCs w:val="22"/>
+        </w:rPr>
+        <w:t xml:space="preserve">	22</w:t>
+      </w:r>
+    </w:p>
+    <w:p>
+      <w:pPr>
+        <w:tabs>
+          <w:tab w:val="right" w:pos="9360" w:leader="dot"/>
+        </w:tabs>
+        <w:spacing w:after="40" w:before="0"/>
+        <w:ind w:left="440" w:right="500"/>
+      </w:pPr>
+      <w:r>
+        <w:rPr>
+          <w:b w:val="false"/>
+          <w:bCs w:val="false"/>
+          <w:sz w:val="20"/>
+          <w:szCs w:val="20"/>
+        </w:rPr>
+        <w:t xml:space="preserve">5.1 Principal findings</w:t>
+      </w:r>
+      <w:r>
+        <w:rPr>
+          <w:b w:val="false"/>
+          <w:bCs w:val="false"/>
+          <w:sz w:val="20"/>
+          <w:szCs w:val="20"/>
+        </w:rPr>
+        <w:t xml:space="preserve">	22</w:t>
+      </w:r>
+    </w:p>
+    <w:p>
+      <w:pPr>
+        <w:tabs>
+          <w:tab w:val="right" w:pos="9360" w:leader="dot"/>
+        </w:tabs>
+        <w:spacing w:after="40" w:before="0"/>
+        <w:ind w:left="440" w:right="500"/>
+      </w:pPr>
+      <w:r>
+        <w:rPr>
+          <w:b w:val="false"/>
+          <w:bCs w:val="false"/>
+          <w:sz w:val="20"/>
+          <w:szCs w:val="20"/>
+        </w:rPr>
+        <w:t xml:space="preserve">5.2 Candidate DPSCs as perivascular progenitors</w:t>
+      </w:r>
+      <w:r>
+        <w:rPr>
+          <w:b w:val="false"/>
+          <w:bCs w:val="false"/>
+          <w:sz w:val="20"/>
+          <w:szCs w:val="20"/>
+        </w:rPr>
+        <w:t xml:space="preserve">	22</w:t>
+      </w:r>
+    </w:p>
+    <w:p>
+      <w:pPr>
+        <w:tabs>
+          <w:tab w:val="right" w:pos="9360" w:leader="dot"/>
+        </w:tabs>
+        <w:spacing w:after="40" w:before="0"/>
+        <w:ind w:left="440" w:right="500"/>
+      </w:pPr>
+      <w:r>
+        <w:rPr>
+          <w:b w:val="false"/>
+          <w:bCs w:val="false"/>
+          <w:sz w:val="20"/>
+          <w:szCs w:val="20"/>
+        </w:rPr>
+        <w:t xml:space="preserve">5.3 Fibroblasts as the main WLS-expressing mesenchymal population</w:t>
+      </w:r>
+      <w:r>
+        <w:rPr>
+          <w:b w:val="false"/>
+          <w:bCs w:val="false"/>
+          <w:sz w:val="20"/>
+          <w:szCs w:val="20"/>
+        </w:rPr>
+        <w:t xml:space="preserve">	22</w:t>
+      </w:r>
+    </w:p>
+    <w:p>
+      <w:pPr>
+        <w:tabs>
+          <w:tab w:val="right" w:pos="9360" w:leader="dot"/>
+        </w:tabs>
+        <w:spacing w:after="40" w:before="0"/>
+        <w:ind w:left="440" w:right="500"/>
+      </w:pPr>
+      <w:r>
+        <w:rPr>
+          <w:b w:val="false"/>
+          <w:bCs w:val="false"/>
+          <w:sz w:val="20"/>
+          <w:szCs w:val="20"/>
+        </w:rPr>
+        <w:t xml:space="preserve">5.4 Methodological implications</w:t>
+      </w:r>
+      <w:r>
+        <w:rPr>
+          <w:b w:val="false"/>
+          <w:bCs w:val="false"/>
+          <w:sz w:val="20"/>
+          <w:szCs w:val="20"/>
+        </w:rPr>
+        <w:t xml:space="preserve">	22</w:t>
+      </w:r>
+    </w:p>
+    <w:p>
+      <w:pPr>
+        <w:tabs>
+          <w:tab w:val="right" w:pos="9360" w:leader="dot"/>
+        </w:tabs>
+        <w:spacing w:after="40" w:before="0"/>
+        <w:ind w:left="440" w:right="500"/>
+      </w:pPr>
+      <w:r>
+        <w:rPr>
+          <w:b w:val="false"/>
+          <w:bCs w:val="false"/>
+          <w:sz w:val="20"/>
+          <w:szCs w:val="20"/>
+        </w:rPr>
+        <w:t xml:space="preserve">5.5 Limitations</w:t>
+      </w:r>
+      <w:r>
+        <w:rPr>
+          <w:b w:val="false"/>
+          <w:bCs w:val="false"/>
+          <w:sz w:val="20"/>
+          <w:szCs w:val="20"/>
+        </w:rPr>
+        <w:t xml:space="preserve">	23</w:t>
+      </w:r>
+    </w:p>
+    <w:p>
+      <w:pPr>
+        <w:tabs>
+          <w:tab w:val="right" w:pos="9360" w:leader="dot"/>
+        </w:tabs>
+        <w:spacing w:after="40" w:before="0"/>
+        <w:ind w:left="440" w:right="500"/>
+      </w:pPr>
+      <w:r>
+        <w:rPr>
+          <w:b w:val="false"/>
+          <w:bCs w:val="false"/>
+          <w:sz w:val="20"/>
+          <w:szCs w:val="20"/>
+        </w:rPr>
+        <w:t xml:space="preserve">5.6 Future directions</w:t>
+      </w:r>
+      <w:r>
+        <w:rPr>
+          <w:b w:val="false"/>
+          <w:bCs w:val="false"/>
+          <w:sz w:val="20"/>
+          <w:szCs w:val="20"/>
+        </w:rPr>
+        <w:t xml:space="preserve">	23</w:t>
+      </w:r>
+    </w:p>
+    <w:p>
+      <w:pPr>
+        <w:tabs>
+          <w:tab w:val="right" w:pos="9360" w:leader="dot"/>
+        </w:tabs>
+        <w:spacing w:after="90" w:before="80"/>
+        <w:ind w:left="0" w:right="500"/>
+      </w:pPr>
+      <w:r>
+        <w:rPr>
+          <w:b/>
+          <w:bCs/>
+          <w:sz w:val="22"/>
+          <w:szCs w:val="22"/>
+        </w:rPr>
+        <w:t xml:space="preserve">6. Conclusion</w:t>
+      </w:r>
+      <w:r>
+        <w:rPr>
+          <w:b/>
+          <w:bCs/>
+          <w:sz w:val="22"/>
+          <w:szCs w:val="22"/>
+        </w:rPr>
+        <w:t xml:space="preserve">	24</w:t>
+      </w:r>
+    </w:p>
+    <w:p>
+      <w:pPr>
+        <w:tabs>
+          <w:tab w:val="right" w:pos="9360" w:leader="dot"/>
+        </w:tabs>
+        <w:spacing w:after="90" w:before="80"/>
+        <w:ind w:left="0" w:right="500"/>
+      </w:pPr>
+      <w:r>
+        <w:rPr>
+          <w:b/>
+          <w:bCs/>
+          <w:sz w:val="22"/>
+          <w:szCs w:val="22"/>
+        </w:rPr>
+        <w:t xml:space="preserve">References</w:t>
+      </w:r>
+      <w:r>
+        <w:rPr>
+          <w:b/>
+          <w:bCs/>
+          <w:sz w:val="22"/>
+          <w:szCs w:val="22"/>
+        </w:rPr>
+        <w:t xml:space="preserve">	25</w:t>
+      </w:r>
+    </w:p>
+    <w:p>
+      <w:pPr>
+        <w:tabs>
+          <w:tab w:val="right" w:pos="9360" w:leader="dot"/>
+        </w:tabs>
+        <w:spacing w:after="90" w:before="80"/>
+        <w:ind w:left="0" w:right="500"/>
+      </w:pPr>
+      <w:r>
+        <w:rPr>
+          <w:b/>
+          <w:bCs/>
+          <w:sz w:val="22"/>
+          <w:szCs w:val="22"/>
+        </w:rPr>
+        <w:t xml:space="preserve">Appendix A. Scripts and outputs</w:t>
+      </w:r>
+      <w:r>
+        <w:rPr>
+          <w:b/>
+          <w:bCs/>
+          <w:sz w:val="22"/>
+          <w:szCs w:val="22"/>
+        </w:rPr>
+        <w:t xml:space="preserve">	27</w:t>
+      </w:r>
+    </w:p>
+    <w:p>
+      <w:pPr>
+        <w:tabs>
+          <w:tab w:val="right" w:pos="9360" w:leader="dot"/>
+        </w:tabs>
+        <w:spacing w:after="90" w:before="80"/>
+        <w:ind w:left="0" w:right="500"/>
+      </w:pPr>
+      <w:r>
+        <w:rPr>
+          <w:b/>
+          <w:bCs/>
+          <w:sz w:val="22"/>
+          <w:szCs w:val="22"/>
+        </w:rPr>
+        <w:t xml:space="preserve">Appendix B. Script listings</w:t>
+      </w:r>
+      <w:r>
+        <w:rPr>
+          <w:b/>
+          <w:bCs/>
+          <w:sz w:val="22"/>
+          <w:szCs w:val="22"/>
+        </w:rPr>
+        <w:t xml:space="preserve">	28</w:t>
+      </w:r>
+    </w:p>
+    <w:p>
+      <w:pPr>
+        <w:tabs>
+          <w:tab w:val="right" w:pos="9360" w:leader="dot"/>
+        </w:tabs>
+        <w:spacing w:after="40" w:before="0"/>
+        <w:ind w:left="440" w:right="500"/>
+      </w:pPr>
+      <w:r>
+        <w:rPr>
+          <w:b w:val="false"/>
+          <w:bCs w:val="false"/>
+          <w:sz w:val="20"/>
+          <w:szCs w:val="20"/>
+        </w:rPr>
+        <w:t xml:space="preserve">B1. scripts/06a_batch_doublets.R: Batch inspection, doublet removal and Harmony integration</w:t>
+      </w:r>
+      <w:r>
+        <w:rPr>
+          <w:b w:val="false"/>
+          <w:bCs w:val="false"/>
+          <w:sz w:val="20"/>
+          <w:szCs w:val="20"/>
+        </w:rPr>
+        <w:t xml:space="preserve">	28</w:t>
+      </w:r>
+    </w:p>
+    <w:p>
+      <w:pPr>
+        <w:tabs>
+          <w:tab w:val="right" w:pos="9360" w:leader="dot"/>
+        </w:tabs>
+        <w:spacing w:after="40" w:before="0"/>
+        <w:ind w:left="440" w:right="500"/>
+      </w:pPr>
+      <w:r>
+        <w:rPr>
+          <w:b w:val="false"/>
+          <w:bCs w:val="false"/>
+          <w:sz w:val="20"/>
+          <w:szCs w:val="20"/>
+        </w:rPr>
+        <w:t xml:space="preserve">B2. scripts/06_annotation.R: Cell type annotation and candidate DPSC identification</w:t>
+      </w:r>
+      <w:r>
+        <w:rPr>
+          <w:b w:val="false"/>
+          <w:bCs w:val="false"/>
+          <w:sz w:val="20"/>
+          <w:szCs w:val="20"/>
+        </w:rPr>
+        <w:t xml:space="preserve">	31</w:t>
+      </w:r>
+    </w:p>
+    <w:p>
+      <w:pPr>
+        <w:tabs>
+          <w:tab w:val="right" w:pos="9360" w:leader="dot"/>
+        </w:tabs>
+        <w:spacing w:after="40" w:before="0"/>
+        <w:ind w:left="440" w:right="500"/>
+      </w:pPr>
+      <w:r>
+        <w:rPr>
+          <w:b w:val="false"/>
+          <w:bCs w:val="false"/>
+          <w:sz w:val="20"/>
+          <w:szCs w:val="20"/>
+        </w:rPr>
+        <w:t xml:space="preserve">B3. scripts/07_WLS_expression.R: Donor-level WLS analysis</w:t>
+      </w:r>
+      <w:r>
+        <w:rPr>
+          <w:b w:val="false"/>
+          <w:bCs w:val="false"/>
+          <w:sz w:val="20"/>
+          <w:szCs w:val="20"/>
+        </w:rPr>
+        <w:t xml:space="preserve">	35</w:t>
+      </w:r>
+    </w:p>
+    <w:p>
+      <w:pPr>
+        <w:tabs>
+          <w:tab w:val="right" w:pos="9360" w:leader="dot"/>
+        </w:tabs>
+        <w:spacing w:after="40" w:before="0"/>
+        <w:ind w:left="440" w:right="500"/>
+      </w:pPr>
+      <w:r>
+        <w:rPr>
+          <w:b w:val="false"/>
+          <w:bCs w:val="false"/>
+          <w:sz w:val="20"/>
+          <w:szCs w:val="20"/>
+        </w:rPr>
+        <w:t xml:space="preserve">B4. scripts/07b_WLS_sensitivity.R: Sensitivity analysis</w:t>
+      </w:r>
+      <w:r>
+        <w:rPr>
+          <w:b w:val="false"/>
+          <w:bCs w:val="false"/>
+          <w:sz w:val="20"/>
+          <w:szCs w:val="20"/>
+        </w:rPr>
+        <w:t xml:space="preserve">	39</w:t>
+      </w:r>
+    </w:p>
+    <w:p>
+      <w:pPr>
+        <w:pageBreakBefore/>
+        <w:spacing w:after="240"/>
+      </w:pPr>
+      <w:r>
+        <w:rPr>
+          <w:b/>
+          <w:bCs/>
+          <w:color w:val="1F4E79"/>
+          <w:sz w:val="32"/>
+          <w:szCs w:val="32"/>
+        </w:rPr>
+        <w:t xml:space="preserve">List of Figures</w:t>
+      </w:r>
+    </w:p>
+    <w:p>
+      <w:pPr>
+        <w:tabs>
+          <w:tab w:val="right" w:pos="9360" w:leader="dot"/>
+        </w:tabs>
+        <w:spacing w:after="90" w:before="80"/>
+        <w:ind w:left="0" w:right="500"/>
+      </w:pPr>
+      <w:r>
+        <w:rPr>
+          <w:b w:val="false"/>
+          <w:bCs w:val="false"/>
+          <w:sz w:val="22"/>
+          <w:szCs w:val="22"/>
+        </w:rPr>
+        <w:t xml:space="preserve">Figure 1. Analysis workflow.</w:t>
+      </w:r>
+      <w:r>
+        <w:rPr>
+          <w:b w:val="false"/>
+          <w:bCs w:val="false"/>
+          <w:sz w:val="22"/>
+          <w:szCs w:val="22"/>
+        </w:rPr>
+        <w:t xml:space="preserve">	11</w:t>
+      </w:r>
+    </w:p>
+    <w:p>
+      <w:pPr>
+        <w:tabs>
+          <w:tab w:val="right" w:pos="9360" w:leader="dot"/>
+        </w:tabs>
+        <w:spacing w:after="90" w:before="80"/>
+        <w:ind w:left="0" w:right="500"/>
+      </w:pPr>
+      <w:r>
+        <w:rPr>
+          <w:b w:val="false"/>
+          <w:bCs w:val="false"/>
+          <w:sz w:val="22"/>
+          <w:szCs w:val="22"/>
+        </w:rPr>
+        <w:t xml:space="preserve">Figure 2. Donor mixing after Harmony integration.</w:t>
+      </w:r>
+      <w:r>
+        <w:rPr>
+          <w:b w:val="false"/>
+          <w:bCs w:val="false"/>
+          <w:sz w:val="22"/>
+          <w:szCs w:val="22"/>
+        </w:rPr>
+        <w:t xml:space="preserve">	15</w:t>
+      </w:r>
+    </w:p>
+    <w:p>
+      <w:pPr>
+        <w:tabs>
+          <w:tab w:val="right" w:pos="9360" w:leader="dot"/>
+        </w:tabs>
+        <w:spacing w:after="90" w:before="80"/>
+        <w:ind w:left="0" w:right="500"/>
+      </w:pPr>
+      <w:r>
+        <w:rPr>
+          <w:b w:val="false"/>
+          <w:bCs w:val="false"/>
+          <w:sz w:val="22"/>
+          <w:szCs w:val="22"/>
+        </w:rPr>
+        <w:t xml:space="preserve">Figure 3. Number of cells per annotated cell type.</w:t>
+      </w:r>
+      <w:r>
+        <w:rPr>
+          <w:b w:val="false"/>
+          <w:bCs w:val="false"/>
+          <w:sz w:val="22"/>
+          <w:szCs w:val="22"/>
+        </w:rPr>
+        <w:t xml:space="preserve">	15</w:t>
+      </w:r>
+    </w:p>
+    <w:p>
+      <w:pPr>
+        <w:tabs>
+          <w:tab w:val="right" w:pos="9360" w:leader="dot"/>
+        </w:tabs>
+        <w:spacing w:after="90" w:before="80"/>
+        <w:ind w:left="0" w:right="500"/>
+      </w:pPr>
+      <w:r>
+        <w:rPr>
+          <w:b w:val="false"/>
+          <w:bCs w:val="false"/>
+          <w:sz w:val="22"/>
+          <w:szCs w:val="22"/>
+        </w:rPr>
+        <w:t xml:space="preserve">Figure 4. Identification of candidate DPSCs within the pulp mesenchyme.</w:t>
+      </w:r>
+      <w:r>
+        <w:rPr>
+          <w:b w:val="false"/>
+          <w:bCs w:val="false"/>
+          <w:sz w:val="22"/>
+          <w:szCs w:val="22"/>
+        </w:rPr>
+        <w:t xml:space="preserve">	17</w:t>
+      </w:r>
+    </w:p>
+    <w:p>
+      <w:pPr>
+        <w:tabs>
+          <w:tab w:val="right" w:pos="9360" w:leader="dot"/>
+        </w:tabs>
+        <w:spacing w:after="90" w:before="80"/>
+        <w:ind w:left="0" w:right="500"/>
+      </w:pPr>
+      <w:r>
+        <w:rPr>
+          <w:b w:val="false"/>
+          <w:bCs w:val="false"/>
+          <w:sz w:val="22"/>
+          <w:szCs w:val="22"/>
+        </w:rPr>
+        <w:t xml:space="preserve">Figure 5. Percentage of WLS-positive cells per donor.</w:t>
+      </w:r>
+      <w:r>
+        <w:rPr>
+          <w:b w:val="false"/>
+          <w:bCs w:val="false"/>
+          <w:sz w:val="22"/>
+          <w:szCs w:val="22"/>
+        </w:rPr>
+        <w:t xml:space="preserve">	17</w:t>
+      </w:r>
+    </w:p>
+    <w:p>
+      <w:pPr>
+        <w:tabs>
+          <w:tab w:val="right" w:pos="9360" w:leader="dot"/>
+        </w:tabs>
+        <w:spacing w:after="90" w:before="80"/>
+        <w:ind w:left="0" w:right="500"/>
+      </w:pPr>
+      <w:r>
+        <w:rPr>
+          <w:b w:val="false"/>
+          <w:bCs w:val="false"/>
+          <w:sz w:val="22"/>
+          <w:szCs w:val="22"/>
+        </w:rPr>
+        <w:t xml:space="preserve">Figure 6. WLS fold change in candidate DPSCs relative to each comparator group (pseudobulk, five donors).</w:t>
+      </w:r>
+      <w:r>
+        <w:rPr>
+          <w:b w:val="false"/>
+          <w:bCs w:val="false"/>
+          <w:sz w:val="22"/>
+          <w:szCs w:val="22"/>
+        </w:rPr>
+        <w:t xml:space="preserve">	18</w:t>
+      </w:r>
+    </w:p>
+    <w:p>
+      <w:pPr>
+        <w:tabs>
+          <w:tab w:val="right" w:pos="9360" w:leader="dot"/>
+        </w:tabs>
+        <w:spacing w:after="90" w:before="80"/>
+        <w:ind w:left="0" w:right="500"/>
+      </w:pPr>
+      <w:r>
+        <w:rPr>
+          <w:b w:val="false"/>
+          <w:bCs w:val="false"/>
+          <w:sz w:val="22"/>
+          <w:szCs w:val="22"/>
+        </w:rPr>
+        <w:t xml:space="preserve">Figure 7. WLS and WNT ligand detection.</w:t>
+      </w:r>
+      <w:r>
+        <w:rPr>
+          <w:b w:val="false"/>
+          <w:bCs w:val="false"/>
+          <w:sz w:val="22"/>
+          <w:szCs w:val="22"/>
+        </w:rPr>
+        <w:t xml:space="preserve">	20</w:t>
+      </w:r>
+    </w:p>
+    <w:p>
+      <w:pPr>
+        <w:tabs>
+          <w:tab w:val="right" w:pos="9360" w:leader="dot"/>
+        </w:tabs>
+        <w:spacing w:after="90" w:before="80"/>
+        <w:ind w:left="0" w:right="500"/>
+      </w:pPr>
+      <w:r>
+        <w:rPr>
+          <w:b w:val="false"/>
+          <w:bCs w:val="false"/>
+          <w:sz w:val="22"/>
+          <w:szCs w:val="22"/>
+        </w:rPr>
+        <w:t xml:space="preserve">Figure 8. WLS fold change in candidate DPSCs relative to other mesenchymal cells under each definition.</w:t>
+      </w:r>
+      <w:r>
+        <w:rPr>
+          <w:b w:val="false"/>
+          <w:bCs w:val="false"/>
+          <w:sz w:val="22"/>
+          <w:szCs w:val="22"/>
+        </w:rPr>
+        <w:t xml:space="preserve">	21</w:t>
+      </w:r>
+    </w:p>
+    <w:p>
+      <w:pPr>
+        <w:tabs>
+          <w:tab w:val="right" w:pos="9360" w:leader="dot"/>
+        </w:tabs>
+        <w:spacing w:after="90" w:before="80"/>
+        <w:ind w:left="0" w:right="500"/>
+      </w:pPr>
+      <w:r>
+        <w:rPr>
+          <w:b w:val="false"/>
+          <w:bCs w:val="false"/>
+          <w:sz w:val="22"/>
+          <w:szCs w:val="22"/>
+        </w:rPr>
+        <w:t xml:space="preserve">Figure 9. WLS detection in candidate DPSCs against median genes detected per cell, by donor.</w:t>
+      </w:r>
+      <w:r>
+        <w:rPr>
+          <w:b w:val="false"/>
+          <w:bCs w:val="false"/>
+          <w:sz w:val="22"/>
+          <w:szCs w:val="22"/>
+        </w:rPr>
+        <w:t xml:space="preserve">	21</w:t>
+      </w:r>
+    </w:p>
+    <w:p>
+      <w:pPr>
+        <w:pageBreakBefore/>
+        <w:spacing w:after="240"/>
+      </w:pPr>
+      <w:r>
+        <w:rPr>
+          <w:b/>
+          <w:bCs/>
+          <w:color w:val="1F4E79"/>
+          <w:sz w:val="32"/>
+          <w:szCs w:val="32"/>
+        </w:rPr>
+        <w:t xml:space="preserve">List of Tables</w:t>
+      </w:r>
+    </w:p>
+    <w:p>
+      <w:pPr>
+        <w:tabs>
+          <w:tab w:val="right" w:pos="9360" w:leader="dot"/>
+        </w:tabs>
+        <w:spacing w:after="90" w:before="80"/>
+        <w:ind w:left="0" w:right="500"/>
+      </w:pPr>
+      <w:r>
+        <w:rPr>
+          <w:b w:val="false"/>
+          <w:bCs w:val="false"/>
+          <w:sz w:val="22"/>
+          <w:szCs w:val="22"/>
+        </w:rPr>
+        <w:t xml:space="preserve">Table 1. Samples in GSE164157.</w:t>
+      </w:r>
+      <w:r>
+        <w:rPr>
+          <w:b w:val="false"/>
+          <w:bCs w:val="false"/>
+          <w:sz w:val="22"/>
+          <w:szCs w:val="22"/>
+        </w:rPr>
+        <w:t xml:space="preserve">	11</w:t>
+      </w:r>
+    </w:p>
+    <w:p>
+      <w:pPr>
+        <w:tabs>
+          <w:tab w:val="right" w:pos="9360" w:leader="dot"/>
+        </w:tabs>
+        <w:spacing w:after="90" w:before="80"/>
+        <w:ind w:left="0" w:right="500"/>
+      </w:pPr>
+      <w:r>
+        <w:rPr>
+          <w:b w:val="false"/>
+          <w:bCs w:val="false"/>
+          <w:sz w:val="22"/>
+          <w:szCs w:val="22"/>
+        </w:rPr>
+        <w:t xml:space="preserve">Table 2. Marker panels used for annotation.</w:t>
+      </w:r>
+      <w:r>
+        <w:rPr>
+          <w:b w:val="false"/>
+          <w:bCs w:val="false"/>
+          <w:sz w:val="22"/>
+          <w:szCs w:val="22"/>
+        </w:rPr>
+        <w:t xml:space="preserve">	12</w:t>
+      </w:r>
+    </w:p>
+    <w:p>
+      <w:pPr>
+        <w:tabs>
+          <w:tab w:val="right" w:pos="9360" w:leader="dot"/>
+        </w:tabs>
+        <w:spacing w:after="90" w:before="80"/>
+        <w:ind w:left="0" w:right="500"/>
+      </w:pPr>
+      <w:r>
+        <w:rPr>
+          <w:b w:val="false"/>
+          <w:bCs w:val="false"/>
+          <w:sz w:val="22"/>
+          <w:szCs w:val="22"/>
+        </w:rPr>
+        <w:t xml:space="preserve">Table 3. Quality control and initial clustering.</w:t>
+      </w:r>
+      <w:r>
+        <w:rPr>
+          <w:b w:val="false"/>
+          <w:bCs w:val="false"/>
+          <w:sz w:val="22"/>
+          <w:szCs w:val="22"/>
+        </w:rPr>
+        <w:t xml:space="preserve">	14</w:t>
+      </w:r>
+    </w:p>
+    <w:p>
+      <w:pPr>
+        <w:tabs>
+          <w:tab w:val="right" w:pos="9360" w:leader="dot"/>
+        </w:tabs>
+        <w:spacing w:after="90" w:before="80"/>
+        <w:ind w:left="0" w:right="500"/>
+      </w:pPr>
+      <w:r>
+        <w:rPr>
+          <w:b w:val="false"/>
+          <w:bCs w:val="false"/>
+          <w:sz w:val="22"/>
+          <w:szCs w:val="22"/>
+        </w:rPr>
+        <w:t xml:space="preserve">Table 4. Doublets detected per donor.</w:t>
+      </w:r>
+      <w:r>
+        <w:rPr>
+          <w:b w:val="false"/>
+          <w:bCs w:val="false"/>
+          <w:sz w:val="22"/>
+          <w:szCs w:val="22"/>
+        </w:rPr>
+        <w:t xml:space="preserve">	14</w:t>
+      </w:r>
+    </w:p>
+    <w:p>
+      <w:pPr>
+        <w:tabs>
+          <w:tab w:val="right" w:pos="9360" w:leader="dot"/>
+        </w:tabs>
+        <w:spacing w:after="90" w:before="80"/>
+        <w:ind w:left="0" w:right="500"/>
+      </w:pPr>
+      <w:r>
+        <w:rPr>
+          <w:b w:val="false"/>
+          <w:bCs w:val="false"/>
+          <w:sz w:val="22"/>
+          <w:szCs w:val="22"/>
+        </w:rPr>
+        <w:t xml:space="preserve">Table 5. Annotated cell types.</w:t>
+      </w:r>
+      <w:r>
+        <w:rPr>
+          <w:b w:val="false"/>
+          <w:bCs w:val="false"/>
+          <w:sz w:val="22"/>
+          <w:szCs w:val="22"/>
+        </w:rPr>
+        <w:t xml:space="preserve">	16</w:t>
+      </w:r>
+    </w:p>
+    <w:p>
+      <w:pPr>
+        <w:tabs>
+          <w:tab w:val="right" w:pos="9360" w:leader="dot"/>
+        </w:tabs>
+        <w:spacing w:after="90" w:before="80"/>
+        <w:ind w:left="0" w:right="500"/>
+      </w:pPr>
+      <w:r>
+        <w:rPr>
+          <w:b w:val="false"/>
+          <w:bCs w:val="false"/>
+          <w:sz w:val="22"/>
+          <w:szCs w:val="22"/>
+        </w:rPr>
+        <w:t xml:space="preserve">Table 6. Mesenchymal sub-clusters ranked by stem/progenitor score.</w:t>
+      </w:r>
+      <w:r>
+        <w:rPr>
+          <w:b w:val="false"/>
+          <w:bCs w:val="false"/>
+          <w:sz w:val="22"/>
+          <w:szCs w:val="22"/>
+        </w:rPr>
+        <w:t xml:space="preserve">	16</w:t>
+      </w:r>
+    </w:p>
+    <w:p>
+      <w:pPr>
+        <w:tabs>
+          <w:tab w:val="right" w:pos="9360" w:leader="dot"/>
+        </w:tabs>
+        <w:spacing w:after="90" w:before="80"/>
+        <w:ind w:left="0" w:right="500"/>
+      </w:pPr>
+      <w:r>
+        <w:rPr>
+          <w:b w:val="false"/>
+          <w:bCs w:val="false"/>
+          <w:sz w:val="22"/>
+          <w:szCs w:val="22"/>
+        </w:rPr>
+        <w:t xml:space="preserve">Table 7. WLS detection by cell group (donors with at least 20 cells in the group).</w:t>
+      </w:r>
+      <w:r>
+        <w:rPr>
+          <w:b w:val="false"/>
+          <w:bCs w:val="false"/>
+          <w:sz w:val="22"/>
+          <w:szCs w:val="22"/>
+        </w:rPr>
+        <w:t xml:space="preserve">	18</w:t>
+      </w:r>
+    </w:p>
+    <w:p>
+      <w:pPr>
+        <w:tabs>
+          <w:tab w:val="right" w:pos="9360" w:leader="dot"/>
+        </w:tabs>
+        <w:spacing w:after="90" w:before="80"/>
+        <w:ind w:left="0" w:right="500"/>
+      </w:pPr>
+      <w:r>
+        <w:rPr>
+          <w:b w:val="false"/>
+          <w:bCs w:val="false"/>
+          <w:sz w:val="22"/>
+          <w:szCs w:val="22"/>
+        </w:rPr>
+        <w:t xml:space="preserve">Table 8. Pseudobulk edgeR tests with donor as a blocking factor.</w:t>
+      </w:r>
+      <w:r>
+        <w:rPr>
+          <w:b w:val="false"/>
+          <w:bCs w:val="false"/>
+          <w:sz w:val="22"/>
+          <w:szCs w:val="22"/>
+        </w:rPr>
+        <w:t xml:space="preserve">	18</w:t>
+      </w:r>
+    </w:p>
+    <w:p>
+      <w:pPr>
+        <w:tabs>
+          <w:tab w:val="right" w:pos="9360" w:leader="dot"/>
+        </w:tabs>
+        <w:spacing w:after="90" w:before="80"/>
+        <w:ind w:left="0" w:right="500"/>
+      </w:pPr>
+      <w:r>
+        <w:rPr>
+          <w:b w:val="false"/>
+          <w:bCs w:val="false"/>
+          <w:sz w:val="22"/>
+          <w:szCs w:val="22"/>
+        </w:rPr>
+        <w:t xml:space="preserve">Table 9. Unadjusted co-expression of WLS with at least one WNT ligand.</w:t>
+      </w:r>
+      <w:r>
+        <w:rPr>
+          <w:b w:val="false"/>
+          <w:bCs w:val="false"/>
+          <w:sz w:val="22"/>
+          <w:szCs w:val="22"/>
+        </w:rPr>
+        <w:t xml:space="preserve">	19</w:t>
+      </w:r>
+    </w:p>
+    <w:p>
+      <w:pPr>
+        <w:tabs>
+          <w:tab w:val="right" w:pos="9360" w:leader="dot"/>
+        </w:tabs>
+        <w:spacing w:after="90" w:before="80"/>
+        <w:ind w:left="0" w:right="500"/>
+      </w:pPr>
+      <w:r>
+        <w:rPr>
+          <w:b w:val="false"/>
+          <w:bCs w:val="false"/>
+          <w:sz w:val="22"/>
+          <w:szCs w:val="22"/>
+        </w:rPr>
+        <w:t xml:space="preserve">Table 10. Odds ratio for WLS detection in WNT-positive versus WNT-negative cells, with donor as covariate, before and after adjustment for genes detected per cell.</w:t>
+      </w:r>
+      <w:r>
+        <w:rPr>
+          <w:b w:val="false"/>
+          <w:bCs w:val="false"/>
+          <w:sz w:val="22"/>
+          <w:szCs w:val="22"/>
+        </w:rPr>
+        <w:t xml:space="preserve">	19</w:t>
+      </w:r>
+    </w:p>
+    <w:p>
+      <w:pPr>
+        <w:tabs>
+          <w:tab w:val="right" w:pos="9360" w:leader="dot"/>
+        </w:tabs>
+        <w:spacing w:after="90" w:before="80"/>
+        <w:ind w:left="0" w:right="500"/>
+      </w:pPr>
+      <w:r>
+        <w:rPr>
+          <w:b w:val="false"/>
+          <w:bCs w:val="false"/>
+          <w:sz w:val="22"/>
+          <w:szCs w:val="22"/>
+        </w:rPr>
+        <w:t xml:space="preserve">Table 11. Percentage of cells expressing each WNT ligand detected in more than 0.5% of either group.</w:t>
+      </w:r>
+      <w:r>
+        <w:rPr>
+          <w:b w:val="false"/>
+          <w:bCs w:val="false"/>
+          <w:sz w:val="22"/>
+          <w:szCs w:val="22"/>
+        </w:rPr>
+        <w:t xml:space="preserve">	19</w:t>
+      </w:r>
+    </w:p>
+    <w:p>
+      <w:pPr>
+        <w:tabs>
+          <w:tab w:val="right" w:pos="9360" w:leader="dot"/>
+        </w:tabs>
+        <w:spacing w:after="90" w:before="80"/>
+        <w:ind w:left="0" w:right="500"/>
+      </w:pPr>
+      <w:r>
+        <w:rPr>
+          <w:b w:val="false"/>
+          <w:bCs w:val="false"/>
+          <w:sz w:val="22"/>
+          <w:szCs w:val="22"/>
+        </w:rPr>
+        <w:t xml:space="preserve">Table 12. Overlap between DPSC definitions (fraction of row-definition cells also in the column definition).</w:t>
+      </w:r>
+      <w:r>
+        <w:rPr>
+          <w:b w:val="false"/>
+          <w:bCs w:val="false"/>
+          <w:sz w:val="22"/>
+          <w:szCs w:val="22"/>
+        </w:rPr>
+        <w:t xml:space="preserve">	20</w:t>
+      </w:r>
+    </w:p>
+    <w:p>
+      <w:pPr>
+        <w:tabs>
+          <w:tab w:val="right" w:pos="9360" w:leader="dot"/>
+        </w:tabs>
+        <w:spacing w:after="90" w:before="80"/>
+        <w:ind w:left="0" w:right="500"/>
+      </w:pPr>
+      <w:r>
+        <w:rPr>
+          <w:b w:val="false"/>
+          <w:bCs w:val="false"/>
+          <w:sz w:val="22"/>
+          <w:szCs w:val="22"/>
+        </w:rPr>
+        <w:t xml:space="preserve">Table 13. WLS in candidate DPSCs versus remaining mesenchymal cells under four definitions.</w:t>
+      </w:r>
+      <w:r>
+        <w:rPr>
+          <w:b w:val="false"/>
+          <w:bCs w:val="false"/>
+          <w:sz w:val="22"/>
+          <w:szCs w:val="22"/>
+        </w:rPr>
+        <w:t xml:space="preserve">	20</w:t>
+      </w:r>
+    </w:p>
+    <w:p>
+      <w:pPr>
+        <w:tabs>
+          <w:tab w:val="right" w:pos="9360" w:leader="dot"/>
+        </w:tabs>
+        <w:spacing w:after="90" w:before="80"/>
+        <w:ind w:left="0" w:right="500"/>
+      </w:pPr>
+      <w:r>
+        <w:rPr>
+          <w:b w:val="false"/>
+          <w:bCs w:val="false"/>
+          <w:sz w:val="22"/>
+          <w:szCs w:val="22"/>
+        </w:rPr>
+        <w:t xml:space="preserve">Table 14. Candidate DPSCs per donor with quality metrics.</w:t>
+      </w:r>
+      <w:r>
+        <w:rPr>
+          <w:b w:val="false"/>
+          <w:bCs w:val="false"/>
+          <w:sz w:val="22"/>
+          <w:szCs w:val="22"/>
+        </w:rPr>
+        <w:t xml:space="preserve">	21</w:t>
+      </w:r>
+    </w:p>
+    <w:p>
+      <w:pPr>
+        <w:tabs>
+          <w:tab w:val="right" w:pos="9360" w:leader="dot"/>
+        </w:tabs>
+        <w:spacing w:after="90" w:before="80"/>
+        <w:ind w:left="0" w:right="500"/>
+      </w:pPr>
+      <w:r>
+        <w:rPr>
+          <w:b w:val="false"/>
+          <w:bCs w:val="false"/>
+          <w:sz w:val="22"/>
+          <w:szCs w:val="22"/>
+        </w:rPr>
+        <w:t xml:space="preserve">Table A1. Pipeline scripts in the order they are run.</w:t>
+      </w:r>
+      <w:r>
+        <w:rPr>
+          <w:b w:val="false"/>
+          <w:bCs w:val="false"/>
+          <w:sz w:val="22"/>
+          <w:szCs w:val="22"/>
+        </w:rPr>
+        <w:t xml:space="preserve">	27</w:t>
       </w:r>
     </w:p>
     <w:p>
@@ -4013,177 +5876,6 @@
         <w:t xml:space="preserve">After Harmony integration, re-clustering produced 16 clusters. All mesenchymal, endothelial and glial clusters drew 27–48% of their cells from their largest donor, indicating good mixing (Figure 2). Four small or immune clusters remained donor-biased. The largest, a T/NK cluster of 1,435 cells, contained no cells from Pulp1–3 and came entirely from Pulp4 and Pulp5, the two samples with high mitochondrial content. This pattern is more consistent with an immune infiltrate in two teeth than with a technical artefact, and the cluster was retained. An epithelial cluster of 87 cells came 82% from Pulp3, suggesting contamination of one sample.</w:t>
       </w:r>
     </w:p>
-    <w:tbl>
-      <w:tblPr>
-        <w:tblW w:type="dxa" w:w="9360"/>
-        <w:tblBorders>
-          <w:top w:val="single" w:color="auto" w:sz="4"/>
-          <w:left w:val="single" w:color="auto" w:sz="4"/>
-          <w:bottom w:val="single" w:color="auto" w:sz="4"/>
-          <w:right w:val="single" w:color="auto" w:sz="4"/>
-          <w:insideH w:val="single" w:color="auto" w:sz="4"/>
-          <w:insideV w:val="single" w:color="auto" w:sz="4"/>
-        </w:tblBorders>
-      </w:tblPr>
-      <w:tblGrid>
-        <w:gridCol w:w="9360"/>
-      </w:tblGrid>
-      <w:tr>
-        <w:trPr>
-          <w:trHeight w:val="3000" w:hRule="atLeast"/>
-        </w:trPr>
-        <w:tc>
-          <w:tcPr>
-            <w:tcW w:type="dxa" w:w="9360"/>
-            <w:tcBorders>
-              <w:top w:val="dashed" w:color="7F8C8D" w:sz="8"/>
-              <w:left w:val="dashed" w:color="7F8C8D" w:sz="8"/>
-              <w:bottom w:val="dashed" w:color="7F8C8D" w:sz="8"/>
-              <w:right w:val="dashed" w:color="7F8C8D" w:sz="8"/>
-            </w:tcBorders>
-            <w:shd w:fill="F4F6F7" w:color="auto" w:val="clear"/>
-            <w:vAlign w:val="center"/>
-          </w:tcPr>
-          <w:p>
-            <w:pPr>
-              <w:spacing w:before="900"/>
-              <w:jc w:val="center"/>
-            </w:pPr>
-            <w:r>
-              <w:rPr>
-                <w:b/>
-                <w:bCs/>
-                <w:color w:val="566573"/>
-              </w:rPr>
-              <w:t xml:space="preserve">Insert figure: results/06a_batch/07_UMAP_after_harmony.png</w:t>
-            </w:r>
-          </w:p>
-          <w:p>
-            <w:pPr>
-              <w:spacing w:after="900"/>
-              <w:jc w:val="center"/>
-            </w:pPr>
-            <w:r>
-              <w:rPr>
-                <w:color w:val="7F8C8D"/>
-                <w:sz w:val="19"/>
-                <w:szCs w:val="19"/>
-              </w:rPr>
-              <w:t xml:space="preserve">UMAP after Harmony coloured by donor (left) and by cluster (right)</w:t>
-            </w:r>
-          </w:p>
-        </w:tc>
-      </w:tr>
-    </w:tbl>
-    <w:p>
-      <w:pPr>
-        <w:spacing w:after="240" w:before="60"/>
-      </w:pPr>
-      <w:r>
-        <w:rPr>
-          <w:i/>
-          <w:iCs/>
-          <w:color w:val="404040"/>
-          <w:sz w:val="19"/>
-          <w:szCs w:val="19"/>
-        </w:rPr>
-        <w:t xml:space="preserve">Figure 2. Donor mixing after Harmony integration.</w:t>
-      </w:r>
-    </w:p>
-    <w:p>
-      <w:pPr>
-        <w:pStyle w:val="Heading2"/>
-      </w:pPr>
-      <w:r>
-        <w:t xml:space="preserve">4.4 Cell type composition</w:t>
-      </w:r>
-    </w:p>
-    <w:p>
-      <w:pPr>
-        <w:spacing w:after="140" w:line="312"/>
-        <w:jc w:val="both"/>
-      </w:pPr>
-      <w:r>
-        <w:t xml:space="preserve">All 16 clusters had a clear best-matching marker panel and were confirmed manually, yielding nine cell types (Figure 3, Table 5). Pulp fibroblasts (41%) and endothelial cells (25%) dominated, followed by perivascular cells, Schwann/glial cells and immune cells. No cluster corresponded to odontoblasts, which are frequently lost during pulp extraction, or to lymphatic or mast cells, which are likely too rare to form separate clusters.</w:t>
-      </w:r>
-    </w:p>
-    <w:tbl>
-      <w:tblPr>
-        <w:tblW w:type="dxa" w:w="9360"/>
-        <w:tblBorders>
-          <w:top w:val="single" w:color="auto" w:sz="4"/>
-          <w:left w:val="single" w:color="auto" w:sz="4"/>
-          <w:bottom w:val="single" w:color="auto" w:sz="4"/>
-          <w:right w:val="single" w:color="auto" w:sz="4"/>
-          <w:insideH w:val="single" w:color="auto" w:sz="4"/>
-          <w:insideV w:val="single" w:color="auto" w:sz="4"/>
-        </w:tblBorders>
-      </w:tblPr>
-      <w:tblGrid>
-        <w:gridCol w:w="9360"/>
-      </w:tblGrid>
-      <w:tr>
-        <w:trPr>
-          <w:trHeight w:val="3000" w:hRule="atLeast"/>
-        </w:trPr>
-        <w:tc>
-          <w:tcPr>
-            <w:tcW w:type="dxa" w:w="9360"/>
-            <w:tcBorders>
-              <w:top w:val="dashed" w:color="7F8C8D" w:sz="8"/>
-              <w:left w:val="dashed" w:color="7F8C8D" w:sz="8"/>
-              <w:bottom w:val="dashed" w:color="7F8C8D" w:sz="8"/>
-              <w:right w:val="dashed" w:color="7F8C8D" w:sz="8"/>
-            </w:tcBorders>
-            <w:shd w:fill="F4F6F7" w:color="auto" w:val="clear"/>
-            <w:vAlign w:val="center"/>
-          </w:tcPr>
-          <w:p>
-            <w:pPr>
-              <w:spacing w:before="900"/>
-              <w:jc w:val="center"/>
-            </w:pPr>
-            <w:r>
-              <w:rPr>
-                <w:b/>
-                <w:bCs/>
-                <w:color w:val="566573"/>
-              </w:rPr>
-              <w:t xml:space="preserve">Insert figure: results/06_annotation/03_UMAP_cell_types.png</w:t>
-            </w:r>
-          </w:p>
-          <w:p>
-            <w:pPr>
-              <w:spacing w:after="900"/>
-              <w:jc w:val="center"/>
-            </w:pPr>
-            <w:r>
-              <w:rPr>
-                <w:color w:val="7F8C8D"/>
-                <w:sz w:val="19"/>
-                <w:szCs w:val="19"/>
-              </w:rPr>
-              <w:t xml:space="preserve">UMAP of 23,327 cells coloured by annotated cell type</w:t>
-            </w:r>
-          </w:p>
-        </w:tc>
-      </w:tr>
-    </w:tbl>
-    <w:p>
-      <w:pPr>
-        <w:spacing w:after="240" w:before="60"/>
-      </w:pPr>
-      <w:r>
-        <w:rPr>
-          <w:i/>
-          <w:iCs/>
-          <w:color w:val="404040"/>
-          <w:sz w:val="19"/>
-          <w:szCs w:val="19"/>
-        </w:rPr>
-        <w:t xml:space="preserve">Figure 3. Annotated cell types in human dental pulp.</w:t>
-      </w:r>
-    </w:p>
     <w:p>
       <w:pPr>
         <w:keepNext/>
@@ -4193,9 +5885,9 @@
       <w:r>
         <w:drawing>
           <wp:inline distT="0" distB="0" distL="0" distR="0">
-            <wp:extent cx="5143500" cy="2466975"/>
+            <wp:extent cx="5334000" cy="2600325"/>
             <wp:effectExtent t="0" r="0" b="0" l="0"/>
-            <wp:docPr id="1" name="fig2_celltypes.png" descr="fig2_celltypes.png" title="fig2_celltypes.png"/>
+            <wp:docPr id="1" name="figB_mixing.png" descr="figB_mixing.png" title="figB_mixing.png"/>
             <wp:cNvGraphicFramePr>
               <a:graphicFrameLocks xmlns:a="http://schemas.openxmlformats.org/drawingml/2006/main" noChangeAspect="1"/>
             </wp:cNvGraphicFramePr>
@@ -4218,6 +5910,85 @@
                   <pic:spPr bwMode="auto">
                     <a:xfrm>
                       <a:off x="0" y="0"/>
+                      <a:ext cx="5334000" cy="2600325"/>
+                    </a:xfrm>
+                    <a:prstGeom prst="rect">
+                      <a:avLst/>
+                    </a:prstGeom>
+                  </pic:spPr>
+                </pic:pic>
+              </a:graphicData>
+            </a:graphic>
+          </wp:inline>
+        </w:drawing>
+      </w:r>
+    </w:p>
+    <w:p>
+      <w:pPr>
+        <w:spacing w:after="240" w:before="60"/>
+      </w:pPr>
+      <w:r>
+        <w:rPr>
+          <w:i/>
+          <w:iCs/>
+          <w:color w:val="404040"/>
+          <w:sz w:val="19"/>
+          <w:szCs w:val="19"/>
+        </w:rPr>
+        <w:t xml:space="preserve">Figure 2. Donor mixing after Harmony integration. Bars show the fraction of each cluster's cells that came from its largest donor; 0.2 would be perfect mixing of five donors.</w:t>
+      </w:r>
+    </w:p>
+    <w:p>
+      <w:pPr>
+        <w:pStyle w:val="Heading2"/>
+      </w:pPr>
+      <w:r>
+        <w:t xml:space="preserve">4.4 Cell type composition</w:t>
+      </w:r>
+    </w:p>
+    <w:p>
+      <w:pPr>
+        <w:spacing w:after="140" w:line="312"/>
+        <w:jc w:val="both"/>
+      </w:pPr>
+      <w:r>
+        <w:t xml:space="preserve">All 16 clusters had a clear best-matching marker panel and were confirmed manually, yielding nine cell types (Table 5, Figure 3). Pulp fibroblasts (41%) and endothelial cells (25%) dominated, followed by perivascular cells, Schwann/glial cells and immune cells. No cluster corresponded to odontoblasts, which are frequently lost during pulp extraction, or to lymphatic or mast cells, which are likely too rare to form separate clusters.</w:t>
+      </w:r>
+    </w:p>
+    <w:p>
+      <w:pPr>
+        <w:keepNext/>
+        <w:spacing w:after="60" w:before="160"/>
+        <w:jc w:val="center"/>
+      </w:pPr>
+      <w:r>
+        <w:drawing>
+          <wp:inline distT="0" distB="0" distL="0" distR="0">
+            <wp:extent cx="5143500" cy="2466975"/>
+            <wp:effectExtent t="0" r="0" b="0" l="0"/>
+            <wp:docPr id="1" name="fig2_celltypes.png" descr="fig2_celltypes.png" title="fig2_celltypes.png"/>
+            <wp:cNvGraphicFramePr>
+              <a:graphicFrameLocks xmlns:a="http://schemas.openxmlformats.org/drawingml/2006/main" noChangeAspect="1"/>
+            </wp:cNvGraphicFramePr>
+            <a:graphic xmlns:a="http://schemas.openxmlformats.org/drawingml/2006/main">
+              <a:graphicData uri="http://schemas.openxmlformats.org/drawingml/2006/picture">
+                <pic:pic xmlns:pic="http://schemas.openxmlformats.org/drawingml/2006/picture">
+                  <pic:nvPicPr>
+                    <pic:cNvPr id="0" name="" descr=""/>
+                    <pic:cNvPicPr>
+                      <a:picLocks noChangeAspect="1" noChangeArrowheads="1"/>
+                    </pic:cNvPicPr>
+                  </pic:nvPicPr>
+                  <pic:blipFill>
+                    <a:blip r:embed="rId10" cstate="none"/>
+                    <a:srcRect/>
+                    <a:stretch>
+                      <a:fillRect/>
+                    </a:stretch>
+                  </pic:blipFill>
+                  <pic:spPr bwMode="auto">
+                    <a:xfrm>
+                      <a:off x="0" y="0"/>
                       <a:ext cx="5143500" cy="2466975"/>
                     </a:xfrm>
                     <a:prstGeom prst="rect">
@@ -4243,7 +6014,7 @@
           <w:sz w:val="19"/>
           <w:szCs w:val="19"/>
         </w:rPr>
-        <w:t xml:space="preserve">Figure 4. Number of cells per cell type. Mesenchymal lineages are shown in orange.</w:t>
+        <w:t xml:space="preserve">Figure 3. Number of cells per annotated cell type. Mesenchymal lineages are shown in orange.</w:t>
       </w:r>
     </w:p>
     <w:tbl>
@@ -5279,7 +7050,7 @@
         <w:jc w:val="both"/>
       </w:pPr>
       <w:r>
-        <w:t xml:space="preserve">Sub-clustering of 12,474 mesenchymal cells produced ten sub-clusters (Table 6, Figure 5). Only the three perivascular sub-clusters had a stem/progenitor score above background (0.04–0.20); all seven fibroblast sub-clusters scored below it. These three sub-clusters, comprising 2,847 cells, were defined as candidate DPSCs. Their perivascular scores (0.62–1.13) were much higher than their stem scores, so they are best described as perivascular cells with progenitor features, consistent with the perivascular niche described by Shi and Gronthos (2003).</w:t>
+        <w:t xml:space="preserve">Sub-clustering of 12,474 mesenchymal cells produced ten sub-clusters (Table 6, Figure 4). Only the three perivascular sub-clusters had a stem/progenitor score above background (0.04–0.20); all seven fibroblast sub-clusters scored below it. These three sub-clusters, comprising 2,847 cells, were defined as candidate DPSCs. Their perivascular scores (0.62–1.13) were much higher than their stem scores, so they are best described as perivascular cells with progenitor features, consistent with the perivascular niche described by Shi and Gronthos (2003).</w:t>
       </w:r>
     </w:p>
     <w:tbl>
@@ -7002,68 +8773,53 @@
         <w:t xml:space="preserve">Table 6. Mesenchymal sub-clusters ranked by stem/progenitor score.</w:t>
       </w:r>
     </w:p>
-    <w:tbl>
-      <w:tblPr>
-        <w:tblW w:type="dxa" w:w="9360"/>
-        <w:tblBorders>
-          <w:top w:val="single" w:color="auto" w:sz="4"/>
-          <w:left w:val="single" w:color="auto" w:sz="4"/>
-          <w:bottom w:val="single" w:color="auto" w:sz="4"/>
-          <w:right w:val="single" w:color="auto" w:sz="4"/>
-          <w:insideH w:val="single" w:color="auto" w:sz="4"/>
-          <w:insideV w:val="single" w:color="auto" w:sz="4"/>
-        </w:tblBorders>
-      </w:tblPr>
-      <w:tblGrid>
-        <w:gridCol w:w="9360"/>
-      </w:tblGrid>
-      <w:tr>
-        <w:trPr>
-          <w:trHeight w:val="3000" w:hRule="atLeast"/>
-        </w:trPr>
-        <w:tc>
-          <w:tcPr>
-            <w:tcW w:type="dxa" w:w="9360"/>
-            <w:tcBorders>
-              <w:top w:val="dashed" w:color="7F8C8D" w:sz="8"/>
-              <w:left w:val="dashed" w:color="7F8C8D" w:sz="8"/>
-              <w:bottom w:val="dashed" w:color="7F8C8D" w:sz="8"/>
-              <w:right w:val="dashed" w:color="7F8C8D" w:sz="8"/>
-            </w:tcBorders>
-            <w:shd w:fill="F4F6F7" w:color="auto" w:val="clear"/>
-            <w:vAlign w:val="center"/>
-          </w:tcPr>
-          <w:p>
-            <w:pPr>
-              <w:spacing w:before="900"/>
-              <w:jc w:val="center"/>
-            </w:pPr>
-            <w:r>
-              <w:rPr>
-                <w:b/>
-                <w:bCs/>
-                <w:color w:val="566573"/>
-              </w:rPr>
-              <w:t xml:space="preserve">Insert figure: results/06_annotation/04_mesenchyme_DPSC_score.png</w:t>
-            </w:r>
-          </w:p>
-          <w:p>
-            <w:pPr>
-              <w:spacing w:after="900"/>
-              <w:jc w:val="center"/>
-            </w:pPr>
-            <w:r>
-              <w:rPr>
-                <w:color w:val="7F8C8D"/>
-                <w:sz w:val="19"/>
-                <w:szCs w:val="19"/>
-              </w:rPr>
-              <w:t xml:space="preserve">Mesenchymal sub-clusters, stem/progenitor score and perivascular score on the mesenchymal UMAP</w:t>
-            </w:r>
-          </w:p>
-        </w:tc>
-      </w:tr>
-    </w:tbl>
+    <w:p>
+      <w:pPr>
+        <w:keepNext/>
+        <w:spacing w:after="60" w:before="160"/>
+        <w:jc w:val="center"/>
+      </w:pPr>
+      <w:r>
+        <w:drawing>
+          <wp:inline distT="0" distB="0" distL="0" distR="0">
+            <wp:extent cx="4476750" cy="3028950"/>
+            <wp:effectExtent t="0" r="0" b="0" l="0"/>
+            <wp:docPr id="1" name="figC_messcores.png" descr="figC_messcores.png" title="figC_messcores.png"/>
+            <wp:cNvGraphicFramePr>
+              <a:graphicFrameLocks xmlns:a="http://schemas.openxmlformats.org/drawingml/2006/main" noChangeAspect="1"/>
+            </wp:cNvGraphicFramePr>
+            <a:graphic xmlns:a="http://schemas.openxmlformats.org/drawingml/2006/main">
+              <a:graphicData uri="http://schemas.openxmlformats.org/drawingml/2006/picture">
+                <pic:pic xmlns:pic="http://schemas.openxmlformats.org/drawingml/2006/picture">
+                  <pic:nvPicPr>
+                    <pic:cNvPr id="0" name="" descr=""/>
+                    <pic:cNvPicPr>
+                      <a:picLocks noChangeAspect="1" noChangeArrowheads="1"/>
+                    </pic:cNvPicPr>
+                  </pic:nvPicPr>
+                  <pic:blipFill>
+                    <a:blip r:embed="rId11" cstate="none"/>
+                    <a:srcRect/>
+                    <a:stretch>
+                      <a:fillRect/>
+                    </a:stretch>
+                  </pic:blipFill>
+                  <pic:spPr bwMode="auto">
+                    <a:xfrm>
+                      <a:off x="0" y="0"/>
+                      <a:ext cx="4476750" cy="3028950"/>
+                    </a:xfrm>
+                    <a:prstGeom prst="rect">
+                      <a:avLst/>
+                    </a:prstGeom>
+                  </pic:spPr>
+                </pic:pic>
+              </a:graphicData>
+            </a:graphic>
+          </wp:inline>
+        </w:drawing>
+      </w:r>
+    </w:p>
     <w:p>
       <w:pPr>
         <w:spacing w:after="240" w:before="60"/>
@@ -7076,7 +8832,7 @@
           <w:sz w:val="19"/>
           <w:szCs w:val="19"/>
         </w:rPr>
-        <w:t xml:space="preserve">Figure 5. Identification of candidate DPSCs within the pulp mesenchyme.</w:t>
+        <w:t xml:space="preserve">Figure 4. Identification of candidate DPSCs within the pulp mesenchyme. Each point is a mesenchymal sub-cluster; only the three perivascular sub-clusters have a stem/progenitor score above background.</w:t>
       </w:r>
     </w:p>
     <w:p>
@@ -7093,84 +8849,7 @@
         <w:jc w:val="both"/>
       </w:pPr>
       <w:r>
-        <w:t xml:space="preserve">WLS was detected in candidate DPSCs in all five donors, with a median of 11.1% of cells (range 1.3–16.8%; Table 7, Figure 7). The highest detection was in pulp fibroblasts (median 20.7%) and myeloid cells (20.0%), followed by Schwann/glial cells (12.2%). Detection was lower in endothelial cells (7.8%) and rare in lymphocytes. This answers Q1 positively: WLS is expressed in candidate DPSCs, reproducibly across donors.</w:t>
-      </w:r>
-    </w:p>
-    <w:tbl>
-      <w:tblPr>
-        <w:tblW w:type="dxa" w:w="9360"/>
-        <w:tblBorders>
-          <w:top w:val="single" w:color="auto" w:sz="4"/>
-          <w:left w:val="single" w:color="auto" w:sz="4"/>
-          <w:bottom w:val="single" w:color="auto" w:sz="4"/>
-          <w:right w:val="single" w:color="auto" w:sz="4"/>
-          <w:insideH w:val="single" w:color="auto" w:sz="4"/>
-          <w:insideV w:val="single" w:color="auto" w:sz="4"/>
-        </w:tblBorders>
-      </w:tblPr>
-      <w:tblGrid>
-        <w:gridCol w:w="9360"/>
-      </w:tblGrid>
-      <w:tr>
-        <w:trPr>
-          <w:trHeight w:val="3000" w:hRule="atLeast"/>
-        </w:trPr>
-        <w:tc>
-          <w:tcPr>
-            <w:tcW w:type="dxa" w:w="9360"/>
-            <w:tcBorders>
-              <w:top w:val="dashed" w:color="7F8C8D" w:sz="8"/>
-              <w:left w:val="dashed" w:color="7F8C8D" w:sz="8"/>
-              <w:bottom w:val="dashed" w:color="7F8C8D" w:sz="8"/>
-              <w:right w:val="dashed" w:color="7F8C8D" w:sz="8"/>
-            </w:tcBorders>
-            <w:shd w:fill="F4F6F7" w:color="auto" w:val="clear"/>
-            <w:vAlign w:val="center"/>
-          </w:tcPr>
-          <w:p>
-            <w:pPr>
-              <w:spacing w:before="900"/>
-              <w:jc w:val="center"/>
-            </w:pPr>
-            <w:r>
-              <w:rPr>
-                <w:b/>
-                <w:bCs/>
-                <w:color w:val="566573"/>
-              </w:rPr>
-              <w:t xml:space="preserve">Insert figure: results/07_WLS/01_UMAP_WLS_and_groups.png</w:t>
-            </w:r>
-          </w:p>
-          <w:p>
-            <w:pPr>
-              <w:spacing w:after="900"/>
-              <w:jc w:val="center"/>
-            </w:pPr>
-            <w:r>
-              <w:rPr>
-                <w:color w:val="7F8C8D"/>
-                <w:sz w:val="19"/>
-                <w:szCs w:val="19"/>
-              </w:rPr>
-              <w:t xml:space="preserve">WLS expression on the UMAP (left) and the cell groups used for analysis (right)</w:t>
-            </w:r>
-          </w:p>
-        </w:tc>
-      </w:tr>
-    </w:tbl>
-    <w:p>
-      <w:pPr>
-        <w:spacing w:after="240" w:before="60"/>
-      </w:pPr>
-      <w:r>
-        <w:rPr>
-          <w:i/>
-          <w:iCs/>
-          <w:color w:val="404040"/>
-          <w:sz w:val="19"/>
-          <w:szCs w:val="19"/>
-        </w:rPr>
-        <w:t xml:space="preserve">Figure 6. Distribution of WLS expression across pulp cells.</w:t>
+        <w:t xml:space="preserve">WLS was detected in candidate DPSCs in all five donors, with a median of 11.1% of cells (range 1.3–16.8%; Table 7, Figure 5). The highest detection was in pulp fibroblasts (median 20.7%) and myeloid cells (20.0%), followed by Schwann/glial cells (12.2%). Detection was lower in endothelial cells (7.8%) and rare in lymphocytes. This answers Q1 positively: WLS is expressed in candidate DPSCs, reproducibly across donors.</w:t>
       </w:r>
     </w:p>
     <w:p>
@@ -7198,7 +8877,7 @@
                     </pic:cNvPicPr>
                   </pic:nvPicPr>
                   <pic:blipFill>
-                    <a:blip r:embed="rId10" cstate="none"/>
+                    <a:blip r:embed="rId12" cstate="none"/>
                     <a:srcRect/>
                     <a:stretch>
                       <a:fillRect/>
@@ -7232,7 +8911,7 @@
           <w:sz w:val="19"/>
           <w:szCs w:val="19"/>
         </w:rPr>
-        <w:t xml:space="preserve">Figure 7. Percentage of WLS-positive cells per donor. Dots show the median across donors and lines the range.</w:t>
+        <w:t xml:space="preserve">Figure 5. Percentage of WLS-positive cells per donor. Dots show the median across donors and lines the range.</w:t>
       </w:r>
     </w:p>
     <w:tbl>
@@ -8509,7 +10188,7 @@
         <w:jc w:val="both"/>
       </w:pPr>
       <w:r>
-        <w:t xml:space="preserve">Donor-paired pseudobulk tests showed that WLS was 1.9-fold lower in candidate DPSCs than in pulp fibroblasts (log2FC −0.95, FDR 0.0014) and 2.5-fold lower than in myeloid cells (FDR 0.0001), but 2.4-fold higher than in endothelial cells (FDR 0.0002). It did not differ from Schwann/glial cells or from all other pulp cells combined (Table 8, Figure 8). Within the mesenchyme, the mixed-effects model gave an odds ratio of 0.43 (95% CI 0.37–0.50) for WLS detection in candidate DPSCs relative to other mesenchymal cells. Hypothesis H2 is therefore not supported.</w:t>
+        <w:t xml:space="preserve">Donor-paired pseudobulk tests showed that WLS was 1.9-fold lower in candidate DPSCs than in pulp fibroblasts (log2FC −0.95, FDR 0.0014) and 2.5-fold lower than in myeloid cells (FDR 0.0001), but 2.4-fold higher than in endothelial cells (FDR 0.0002). It did not differ from Schwann/glial cells or from all other pulp cells combined (Table 8, Figure 6). Within the mesenchyme, the mixed-effects model gave an odds ratio of 0.43 (95% CI 0.37–0.50) for WLS detection in candidate DPSCs relative to other mesenchymal cells. Hypothesis H2 is therefore not supported.</w:t>
       </w:r>
     </w:p>
     <w:p>
@@ -8537,7 +10216,7 @@
                     </pic:cNvPicPr>
                   </pic:nvPicPr>
                   <pic:blipFill>
-                    <a:blip r:embed="rId11" cstate="none"/>
+                    <a:blip r:embed="rId13" cstate="none"/>
                     <a:srcRect/>
                     <a:stretch>
                       <a:fillRect/>
@@ -8571,7 +10250,7 @@
           <w:sz w:val="19"/>
           <w:szCs w:val="19"/>
         </w:rPr>
-        <w:t xml:space="preserve">Figure 8. WLS fold change in candidate DPSCs relative to each comparator group (pseudobulk, five donors).</w:t>
+        <w:t xml:space="preserve">Figure 6. WLS fold change in candidate DPSCs relative to each comparator group (pseudobulk, five donors).</w:t>
       </w:r>
     </w:p>
     <w:tbl>
@@ -11831,7 +13510,7 @@
         <w:jc w:val="both"/>
       </w:pPr>
       <w:r>
-        <w:t xml:space="preserve">Candidate DPSCs and fibroblasts expressed different ligands (Table 11). Candidate DPSCs mainly expressed WNT6 (3.8% of cells), whereas fibroblasts mainly expressed WNT5A (10.0%) and WNT5B (3.6%). Fibroblasts thus combine the highest WLS detection with the highest expression of WNT5A.</w:t>
+        <w:t xml:space="preserve">Candidate DPSCs and fibroblasts expressed different ligands (Table 11, Figure 7). Candidate DPSCs mainly expressed WNT6 (3.8% of cells), whereas fibroblasts mainly expressed WNT5A (10.0%) and WNT5B (3.6%). Fibroblasts thus combine the highest WLS detection with the highest expression of WNT5A.</w:t>
       </w:r>
     </w:p>
     <w:tbl>
@@ -12339,68 +14018,53 @@
         <w:t xml:space="preserve">Table 11. Percentage of cells expressing each WNT ligand detected in more than 0.5% of either group.</w:t>
       </w:r>
     </w:p>
-    <w:tbl>
-      <w:tblPr>
-        <w:tblW w:type="dxa" w:w="9360"/>
-        <w:tblBorders>
-          <w:top w:val="single" w:color="auto" w:sz="4"/>
-          <w:left w:val="single" w:color="auto" w:sz="4"/>
-          <w:bottom w:val="single" w:color="auto" w:sz="4"/>
-          <w:right w:val="single" w:color="auto" w:sz="4"/>
-          <w:insideH w:val="single" w:color="auto" w:sz="4"/>
-          <w:insideV w:val="single" w:color="auto" w:sz="4"/>
-        </w:tblBorders>
-      </w:tblPr>
-      <w:tblGrid>
-        <w:gridCol w:w="9360"/>
-      </w:tblGrid>
-      <w:tr>
-        <w:trPr>
-          <w:trHeight w:val="3000" w:hRule="atLeast"/>
-        </w:trPr>
-        <w:tc>
-          <w:tcPr>
-            <w:tcW w:type="dxa" w:w="9360"/>
-            <w:tcBorders>
-              <w:top w:val="dashed" w:color="7F8C8D" w:sz="8"/>
-              <w:left w:val="dashed" w:color="7F8C8D" w:sz="8"/>
-              <w:bottom w:val="dashed" w:color="7F8C8D" w:sz="8"/>
-              <w:right w:val="dashed" w:color="7F8C8D" w:sz="8"/>
-            </w:tcBorders>
-            <w:shd w:fill="F4F6F7" w:color="auto" w:val="clear"/>
-            <w:vAlign w:val="center"/>
-          </w:tcPr>
-          <w:p>
-            <w:pPr>
-              <w:spacing w:before="900"/>
-              <w:jc w:val="center"/>
-            </w:pPr>
-            <w:r>
-              <w:rPr>
-                <w:b/>
-                <w:bCs/>
-                <w:color w:val="566573"/>
-              </w:rPr>
-              <w:t xml:space="preserve">Insert figure: results/07_WLS/03_DotPlot_WLS_WNT_ligands.png</w:t>
-            </w:r>
-          </w:p>
-          <w:p>
-            <w:pPr>
-              <w:spacing w:after="900"/>
-              <w:jc w:val="center"/>
-            </w:pPr>
-            <w:r>
-              <w:rPr>
-                <w:color w:val="7F8C8D"/>
-                <w:sz w:val="19"/>
-                <w:szCs w:val="19"/>
-              </w:rPr>
-              <w:t xml:space="preserve">Dot plot of WLS, PORCN and WNT ligands across cell groups</w:t>
-            </w:r>
-          </w:p>
-        </w:tc>
-      </w:tr>
-    </w:tbl>
+    <w:p>
+      <w:pPr>
+        <w:keepNext/>
+        <w:spacing w:after="60" w:before="160"/>
+        <w:jc w:val="center"/>
+      </w:pPr>
+      <w:r>
+        <w:drawing>
+          <wp:inline distT="0" distB="0" distL="0" distR="0">
+            <wp:extent cx="5715000" cy="2171700"/>
+            <wp:effectExtent t="0" r="0" b="0" l="0"/>
+            <wp:docPr id="1" name="figD_wnt.png" descr="figD_wnt.png" title="figD_wnt.png"/>
+            <wp:cNvGraphicFramePr>
+              <a:graphicFrameLocks xmlns:a="http://schemas.openxmlformats.org/drawingml/2006/main" noChangeAspect="1"/>
+            </wp:cNvGraphicFramePr>
+            <a:graphic xmlns:a="http://schemas.openxmlformats.org/drawingml/2006/main">
+              <a:graphicData uri="http://schemas.openxmlformats.org/drawingml/2006/picture">
+                <pic:pic xmlns:pic="http://schemas.openxmlformats.org/drawingml/2006/picture">
+                  <pic:nvPicPr>
+                    <pic:cNvPr id="0" name="" descr=""/>
+                    <pic:cNvPicPr>
+                      <a:picLocks noChangeAspect="1" noChangeArrowheads="1"/>
+                    </pic:cNvPicPr>
+                  </pic:nvPicPr>
+                  <pic:blipFill>
+                    <a:blip r:embed="rId14" cstate="none"/>
+                    <a:srcRect/>
+                    <a:stretch>
+                      <a:fillRect/>
+                    </a:stretch>
+                  </pic:blipFill>
+                  <pic:spPr bwMode="auto">
+                    <a:xfrm>
+                      <a:off x="0" y="0"/>
+                      <a:ext cx="5715000" cy="2171700"/>
+                    </a:xfrm>
+                    <a:prstGeom prst="rect">
+                      <a:avLst/>
+                    </a:prstGeom>
+                  </pic:spPr>
+                </pic:pic>
+              </a:graphicData>
+            </a:graphic>
+          </wp:inline>
+        </w:drawing>
+      </w:r>
+    </w:p>
     <w:p>
       <w:pPr>
         <w:spacing w:after="240" w:before="60"/>
@@ -12413,7 +14077,7 @@
           <w:sz w:val="19"/>
           <w:szCs w:val="19"/>
         </w:rPr>
-        <w:t xml:space="preserve">Figure 9. WLS, PORCN and WNT ligand expression across pulp cell groups.</w:t>
+        <w:t xml:space="preserve">Figure 7. WLS and WNT ligand detection. Left: percentage of cells with WLS and with any WNT ligand in each group. Right: individual WNT ligands in candidate DPSCs and pulp fibroblasts.</w:t>
       </w:r>
     </w:p>
     <w:p>
@@ -12430,7 +14094,7 @@
         <w:jc w:val="both"/>
       </w:pPr>
       <w:r>
-        <w:t xml:space="preserve">The four definitions selected substantially different cells (Table 12): for example, only 21% of cells with three or more stem markers fell in the perivascular sub-clusters, whereas 79% of the perivascular-cluster cells were MCAM⁺. Despite this, WLS was never higher in candidate DPSCs. It was significantly lower under definitions A, B and D (log2FC −0.44 to −0.95) and similar to other mesenchymal cells under definition C (Table 13, Figure 10). Definition C selects cells with high transcript capture, which favours WLS detection; it is therefore the definition least likely to show a deficit.</w:t>
+        <w:t xml:space="preserve">The four definitions selected substantially different cells (Table 12): for example, only 21% of cells with three or more stem markers fell in the perivascular sub-clusters, whereas 79% of the perivascular-cluster cells were MCAM⁺. Despite this, WLS was never higher in candidate DPSCs. It was significantly lower under definitions A, B and D (log2FC −0.44 to −0.95) and similar to other mesenchymal cells under definition C (Table 13, Figure 8). Definition C selects cells with high transcript capture, which favours WLS detection; it is therefore the definition least likely to show a deficit.</w:t>
       </w:r>
     </w:p>
     <w:tbl>
@@ -14108,7 +15772,7 @@
                     </pic:cNvPicPr>
                   </pic:nvPicPr>
                   <pic:blipFill>
-                    <a:blip r:embed="rId12" cstate="none"/>
+                    <a:blip r:embed="rId15" cstate="none"/>
                     <a:srcRect/>
                     <a:stretch>
                       <a:fillRect/>
@@ -14142,7 +15806,7 @@
           <w:sz w:val="19"/>
           <w:szCs w:val="19"/>
         </w:rPr>
-        <w:t xml:space="preserve">Figure 10. WLS fold change in candidate DPSCs relative to other mesenchymal cells under each definition.</w:t>
+        <w:t xml:space="preserve">Figure 8. WLS fold change in candidate DPSCs relative to other mesenchymal cells under each definition.</w:t>
       </w:r>
     </w:p>
     <w:p>
@@ -14159,7 +15823,7 @@
         <w:jc w:val="both"/>
       </w:pPr>
       <w:r>
-        <w:t xml:space="preserve">The donor with the lowest WLS detection in candidate DPSCs was Pulp3 (1.3%), whose candidate DPSCs had a median of 446 genes and 656 UMIs per cell, roughly one-third of the genes of the best-sequenced donors (Table 14). Across donors, WLS detection rose with sequencing depth (Figure 11). Pulp4 and Pulp5, despite their higher mitochondrial content, had the highest detection. Because pseudobulk comparisons are made within donors, these differences do not bias the fold changes, but they mean that percentages of WLS-positive cells should not be compared between donors.</w:t>
+        <w:t xml:space="preserve">The donor with the lowest WLS detection in candidate DPSCs was Pulp3 (1.3%), whose candidate DPSCs had a median of 446 genes and 656 UMIs per cell, roughly one-third of the genes of the best-sequenced donors (Table 14). Across donors, WLS detection rose with sequencing depth (Figure 9). Pulp4 and Pulp5, despite their higher mitochondrial content, had the highest detection. Because pseudobulk comparisons are made within donors, these differences do not bias the fold changes, but they mean that percentages of WLS-positive cells should not be compared between donors.</w:t>
       </w:r>
     </w:p>
     <w:tbl>
@@ -15327,7 +16991,7 @@
                     </pic:cNvPicPr>
                   </pic:nvPicPr>
                   <pic:blipFill>
-                    <a:blip r:embed="rId13" cstate="none"/>
+                    <a:blip r:embed="rId16" cstate="none"/>
                     <a:srcRect/>
                     <a:stretch>
                       <a:fillRect/>
@@ -15361,7 +17025,7 @@
           <w:sz w:val="19"/>
           <w:szCs w:val="19"/>
         </w:rPr>
-        <w:t xml:space="preserve">Figure 11. WLS detection in candidate DPSCs against median genes detected per cell, by donor.</w:t>
+        <w:t xml:space="preserve">Figure 9. WLS detection in candidate DPSCs against median genes detected per cell, by donor.</w:t>
       </w:r>
     </w:p>
     <w:p>

</xml_diff>